<commit_message>
Revisión de redacción y de la documentación
</commit_message>
<xml_diff>
--- a/manuales/Descripcion_del_Software_VoxControlResearch.docx
+++ b/manuales/Descripcion_del_Software_VoxControlResearch.docx
@@ -139,7 +139,7 @@
               <w:rPr>
                 <w:sz w:val="19"/>
               </w:rPr>
-              <w:t>2026-10-06</w:t>
+              <w:t>2026-10-07</w:t>
             </w:r>
           </w:p>
         </w:tc>
@@ -174,36 +174,6 @@
           </w:p>
         </w:tc>
       </w:tr>
-      <w:tr>
-        <w:tc>
-          <w:tcPr>
-            <w:tcW w:w="2835" w:type="dxa"/>
-            <w:shd w:val="clear" w:color="auto" w:fill="EAF1F1"/>
-          </w:tcPr>
-          <w:p>
-            <w:r>
-              <w:rPr>
-                <w:b/>
-                <w:sz w:val="19"/>
-              </w:rPr>
-              <w:t>Repositorio:</w:t>
-            </w:r>
-          </w:p>
-        </w:tc>
-        <w:tc>
-          <w:tcPr>
-            <w:tcW w:w="6803" w:type="dxa"/>
-          </w:tcPr>
-          <w:p>
-            <w:r>
-              <w:rPr>
-                <w:sz w:val="19"/>
-              </w:rPr>
-              <w:t>https://github.com/fjburgosf/VoxControlResearch</w:t>
-            </w:r>
-          </w:p>
-        </w:tc>
-      </w:tr>
     </w:tbl>
     <w:p>
       <w:r>
@@ -246,7 +216,7 @@
       <w:r>
         <w:fldChar w:fldCharType="separate"/>
       </w:r>
-      <w:hyperlink w:anchor="_Toc242197341" w:history="1">
+      <w:hyperlink w:anchor="_Toc242290522" w:history="1">
         <w:r>
           <w:rPr>
             <w:rStyle w:val="Hyperlink"/>
@@ -273,7 +243,7 @@
             <w:noProof/>
             <w:webHidden/>
           </w:rPr>
-          <w:instrText xml:space="preserve"> PAGEREF _Toc242197341 \h </w:instrText>
+          <w:instrText xml:space="preserve"> PAGEREF _Toc242290522 \h </w:instrText>
         </w:r>
         <w:r>
           <w:rPr>
@@ -320,7 +290,7 @@
           <w14:ligatures w14:val="standardContextual"/>
         </w:rPr>
       </w:pPr>
-      <w:hyperlink w:anchor="_Toc242197342" w:history="1">
+      <w:hyperlink w:anchor="_Toc242290523" w:history="1">
         <w:r>
           <w:rPr>
             <w:rStyle w:val="Hyperlink"/>
@@ -347,7 +317,7 @@
             <w:noProof/>
             <w:webHidden/>
           </w:rPr>
-          <w:instrText xml:space="preserve"> PAGEREF _Toc242197342 \h </w:instrText>
+          <w:instrText xml:space="preserve"> PAGEREF _Toc242290523 \h </w:instrText>
         </w:r>
         <w:r>
           <w:rPr>
@@ -394,7 +364,7 @@
           <w14:ligatures w14:val="standardContextual"/>
         </w:rPr>
       </w:pPr>
-      <w:hyperlink w:anchor="_Toc242197343" w:history="1">
+      <w:hyperlink w:anchor="_Toc242290524" w:history="1">
         <w:r>
           <w:rPr>
             <w:rStyle w:val="Hyperlink"/>
@@ -421,7 +391,7 @@
             <w:noProof/>
             <w:webHidden/>
           </w:rPr>
-          <w:instrText xml:space="preserve"> PAGEREF _Toc242197343 \h </w:instrText>
+          <w:instrText xml:space="preserve"> PAGEREF _Toc242290524 \h </w:instrText>
         </w:r>
         <w:r>
           <w:rPr>
@@ -468,7 +438,7 @@
           <w14:ligatures w14:val="standardContextual"/>
         </w:rPr>
       </w:pPr>
-      <w:hyperlink w:anchor="_Toc242197344" w:history="1">
+      <w:hyperlink w:anchor="_Toc242290525" w:history="1">
         <w:r>
           <w:rPr>
             <w:rStyle w:val="Hyperlink"/>
@@ -495,7 +465,7 @@
             <w:noProof/>
             <w:webHidden/>
           </w:rPr>
-          <w:instrText xml:space="preserve"> PAGEREF _Toc242197344 \h </w:instrText>
+          <w:instrText xml:space="preserve"> PAGEREF _Toc242290525 \h </w:instrText>
         </w:r>
         <w:r>
           <w:rPr>
@@ -542,7 +512,7 @@
           <w14:ligatures w14:val="standardContextual"/>
         </w:rPr>
       </w:pPr>
-      <w:hyperlink w:anchor="_Toc242197345" w:history="1">
+      <w:hyperlink w:anchor="_Toc242290526" w:history="1">
         <w:r>
           <w:rPr>
             <w:rStyle w:val="Hyperlink"/>
@@ -569,7 +539,7 @@
             <w:noProof/>
             <w:webHidden/>
           </w:rPr>
-          <w:instrText xml:space="preserve"> PAGEREF _Toc242197345 \h </w:instrText>
+          <w:instrText xml:space="preserve"> PAGEREF _Toc242290526 \h </w:instrText>
         </w:r>
         <w:r>
           <w:rPr>
@@ -616,7 +586,7 @@
           <w14:ligatures w14:val="standardContextual"/>
         </w:rPr>
       </w:pPr>
-      <w:hyperlink w:anchor="_Toc242197346" w:history="1">
+      <w:hyperlink w:anchor="_Toc242290527" w:history="1">
         <w:r>
           <w:rPr>
             <w:rStyle w:val="Hyperlink"/>
@@ -643,7 +613,7 @@
             <w:noProof/>
             <w:webHidden/>
           </w:rPr>
-          <w:instrText xml:space="preserve"> PAGEREF _Toc242197346 \h </w:instrText>
+          <w:instrText xml:space="preserve"> PAGEREF _Toc242290527 \h </w:instrText>
         </w:r>
         <w:r>
           <w:rPr>
@@ -690,7 +660,7 @@
           <w14:ligatures w14:val="standardContextual"/>
         </w:rPr>
       </w:pPr>
-      <w:hyperlink w:anchor="_Toc242197347" w:history="1">
+      <w:hyperlink w:anchor="_Toc242290528" w:history="1">
         <w:r>
           <w:rPr>
             <w:rStyle w:val="Hyperlink"/>
@@ -717,7 +687,7 @@
             <w:noProof/>
             <w:webHidden/>
           </w:rPr>
-          <w:instrText xml:space="preserve"> PAGEREF _Toc242197347 \h </w:instrText>
+          <w:instrText xml:space="preserve"> PAGEREF _Toc242290528 \h </w:instrText>
         </w:r>
         <w:r>
           <w:rPr>
@@ -764,7 +734,7 @@
           <w14:ligatures w14:val="standardContextual"/>
         </w:rPr>
       </w:pPr>
-      <w:hyperlink w:anchor="_Toc242197348" w:history="1">
+      <w:hyperlink w:anchor="_Toc242290529" w:history="1">
         <w:r>
           <w:rPr>
             <w:rStyle w:val="Hyperlink"/>
@@ -791,7 +761,7 @@
             <w:noProof/>
             <w:webHidden/>
           </w:rPr>
-          <w:instrText xml:space="preserve"> PAGEREF _Toc242197348 \h </w:instrText>
+          <w:instrText xml:space="preserve"> PAGEREF _Toc242290529 \h </w:instrText>
         </w:r>
         <w:r>
           <w:rPr>
@@ -838,7 +808,7 @@
           <w14:ligatures w14:val="standardContextual"/>
         </w:rPr>
       </w:pPr>
-      <w:hyperlink w:anchor="_Toc242197349" w:history="1">
+      <w:hyperlink w:anchor="_Toc242290530" w:history="1">
         <w:r>
           <w:rPr>
             <w:rStyle w:val="Hyperlink"/>
@@ -865,7 +835,7 @@
             <w:noProof/>
             <w:webHidden/>
           </w:rPr>
-          <w:instrText xml:space="preserve"> PAGEREF _Toc242197349 \h </w:instrText>
+          <w:instrText xml:space="preserve"> PAGEREF _Toc242290530 \h </w:instrText>
         </w:r>
         <w:r>
           <w:rPr>
@@ -912,7 +882,7 @@
           <w14:ligatures w14:val="standardContextual"/>
         </w:rPr>
       </w:pPr>
-      <w:hyperlink w:anchor="_Toc242197350" w:history="1">
+      <w:hyperlink w:anchor="_Toc242290531" w:history="1">
         <w:r>
           <w:rPr>
             <w:rStyle w:val="Hyperlink"/>
@@ -939,7 +909,7 @@
             <w:noProof/>
             <w:webHidden/>
           </w:rPr>
-          <w:instrText xml:space="preserve"> PAGEREF _Toc242197350 \h </w:instrText>
+          <w:instrText xml:space="preserve"> PAGEREF _Toc242290531 \h </w:instrText>
         </w:r>
         <w:r>
           <w:rPr>
@@ -986,7 +956,7 @@
           <w14:ligatures w14:val="standardContextual"/>
         </w:rPr>
       </w:pPr>
-      <w:hyperlink w:anchor="_Toc242197351" w:history="1">
+      <w:hyperlink w:anchor="_Toc242290532" w:history="1">
         <w:r>
           <w:rPr>
             <w:rStyle w:val="Hyperlink"/>
@@ -1013,7 +983,7 @@
             <w:noProof/>
             <w:webHidden/>
           </w:rPr>
-          <w:instrText xml:space="preserve"> PAGEREF _Toc242197351 \h </w:instrText>
+          <w:instrText xml:space="preserve"> PAGEREF _Toc242290532 \h </w:instrText>
         </w:r>
         <w:r>
           <w:rPr>
@@ -1060,7 +1030,7 @@
           <w14:ligatures w14:val="standardContextual"/>
         </w:rPr>
       </w:pPr>
-      <w:hyperlink w:anchor="_Toc242197352" w:history="1">
+      <w:hyperlink w:anchor="_Toc242290533" w:history="1">
         <w:r>
           <w:rPr>
             <w:rStyle w:val="Hyperlink"/>
@@ -1087,7 +1057,7 @@
             <w:noProof/>
             <w:webHidden/>
           </w:rPr>
-          <w:instrText xml:space="preserve"> PAGEREF _Toc242197352 \h </w:instrText>
+          <w:instrText xml:space="preserve"> PAGEREF _Toc242290533 \h </w:instrText>
         </w:r>
         <w:r>
           <w:rPr>
@@ -1134,7 +1104,7 @@
           <w14:ligatures w14:val="standardContextual"/>
         </w:rPr>
       </w:pPr>
-      <w:hyperlink w:anchor="_Toc242197353" w:history="1">
+      <w:hyperlink w:anchor="_Toc242290534" w:history="1">
         <w:r>
           <w:rPr>
             <w:rStyle w:val="Hyperlink"/>
@@ -1161,7 +1131,7 @@
             <w:noProof/>
             <w:webHidden/>
           </w:rPr>
-          <w:instrText xml:space="preserve"> PAGEREF _Toc242197353 \h </w:instrText>
+          <w:instrText xml:space="preserve"> PAGEREF _Toc242290534 \h </w:instrText>
         </w:r>
         <w:r>
           <w:rPr>
@@ -1208,7 +1178,7 @@
           <w14:ligatures w14:val="standardContextual"/>
         </w:rPr>
       </w:pPr>
-      <w:hyperlink w:anchor="_Toc242197354" w:history="1">
+      <w:hyperlink w:anchor="_Toc242290535" w:history="1">
         <w:r>
           <w:rPr>
             <w:rStyle w:val="Hyperlink"/>
@@ -1235,7 +1205,7 @@
             <w:noProof/>
             <w:webHidden/>
           </w:rPr>
-          <w:instrText xml:space="preserve"> PAGEREF _Toc242197354 \h </w:instrText>
+          <w:instrText xml:space="preserve"> PAGEREF _Toc242290535 \h </w:instrText>
         </w:r>
         <w:r>
           <w:rPr>
@@ -1282,7 +1252,7 @@
           <w14:ligatures w14:val="standardContextual"/>
         </w:rPr>
       </w:pPr>
-      <w:hyperlink w:anchor="_Toc242197355" w:history="1">
+      <w:hyperlink w:anchor="_Toc242290536" w:history="1">
         <w:r>
           <w:rPr>
             <w:rStyle w:val="Hyperlink"/>
@@ -1309,7 +1279,7 @@
             <w:noProof/>
             <w:webHidden/>
           </w:rPr>
-          <w:instrText xml:space="preserve"> PAGEREF _Toc242197355 \h </w:instrText>
+          <w:instrText xml:space="preserve"> PAGEREF _Toc242290536 \h </w:instrText>
         </w:r>
         <w:r>
           <w:rPr>
@@ -1356,7 +1326,7 @@
           <w14:ligatures w14:val="standardContextual"/>
         </w:rPr>
       </w:pPr>
-      <w:hyperlink w:anchor="_Toc242197356" w:history="1">
+      <w:hyperlink w:anchor="_Toc242290537" w:history="1">
         <w:r>
           <w:rPr>
             <w:rStyle w:val="Hyperlink"/>
@@ -1383,7 +1353,7 @@
             <w:noProof/>
             <w:webHidden/>
           </w:rPr>
-          <w:instrText xml:space="preserve"> PAGEREF _Toc242197356 \h </w:instrText>
+          <w:instrText xml:space="preserve"> PAGEREF _Toc242290537 \h </w:instrText>
         </w:r>
         <w:r>
           <w:rPr>
@@ -1430,7 +1400,7 @@
           <w14:ligatures w14:val="standardContextual"/>
         </w:rPr>
       </w:pPr>
-      <w:hyperlink w:anchor="_Toc242197357" w:history="1">
+      <w:hyperlink w:anchor="_Toc242290538" w:history="1">
         <w:r>
           <w:rPr>
             <w:rStyle w:val="Hyperlink"/>
@@ -1457,7 +1427,7 @@
             <w:noProof/>
             <w:webHidden/>
           </w:rPr>
-          <w:instrText xml:space="preserve"> PAGEREF _Toc242197357 \h </w:instrText>
+          <w:instrText xml:space="preserve"> PAGEREF _Toc242290538 \h </w:instrText>
         </w:r>
         <w:r>
           <w:rPr>
@@ -1504,7 +1474,7 @@
           <w14:ligatures w14:val="standardContextual"/>
         </w:rPr>
       </w:pPr>
-      <w:hyperlink w:anchor="_Toc242197358" w:history="1">
+      <w:hyperlink w:anchor="_Toc242290539" w:history="1">
         <w:r>
           <w:rPr>
             <w:rStyle w:val="Hyperlink"/>
@@ -1531,7 +1501,7 @@
             <w:noProof/>
             <w:webHidden/>
           </w:rPr>
-          <w:instrText xml:space="preserve"> PAGEREF _Toc242197358 \h </w:instrText>
+          <w:instrText xml:space="preserve"> PAGEREF _Toc242290539 \h </w:instrText>
         </w:r>
         <w:r>
           <w:rPr>
@@ -1578,7 +1548,7 @@
           <w14:ligatures w14:val="standardContextual"/>
         </w:rPr>
       </w:pPr>
-      <w:hyperlink w:anchor="_Toc242197359" w:history="1">
+      <w:hyperlink w:anchor="_Toc242290540" w:history="1">
         <w:r>
           <w:rPr>
             <w:rStyle w:val="Hyperlink"/>
@@ -1605,7 +1575,7 @@
             <w:noProof/>
             <w:webHidden/>
           </w:rPr>
-          <w:instrText xml:space="preserve"> PAGEREF _Toc242197359 \h </w:instrText>
+          <w:instrText xml:space="preserve"> PAGEREF _Toc242290540 \h </w:instrText>
         </w:r>
         <w:r>
           <w:rPr>
@@ -1652,7 +1622,7 @@
           <w14:ligatures w14:val="standardContextual"/>
         </w:rPr>
       </w:pPr>
-      <w:hyperlink w:anchor="_Toc242197360" w:history="1">
+      <w:hyperlink w:anchor="_Toc242290541" w:history="1">
         <w:r>
           <w:rPr>
             <w:rStyle w:val="Hyperlink"/>
@@ -1679,7 +1649,7 @@
             <w:noProof/>
             <w:webHidden/>
           </w:rPr>
-          <w:instrText xml:space="preserve"> PAGEREF _Toc242197360 \h </w:instrText>
+          <w:instrText xml:space="preserve"> PAGEREF _Toc242290541 \h </w:instrText>
         </w:r>
         <w:r>
           <w:rPr>
@@ -1726,7 +1696,7 @@
           <w14:ligatures w14:val="standardContextual"/>
         </w:rPr>
       </w:pPr>
-      <w:hyperlink w:anchor="_Toc242197361" w:history="1">
+      <w:hyperlink w:anchor="_Toc242290542" w:history="1">
         <w:r>
           <w:rPr>
             <w:rStyle w:val="Hyperlink"/>
@@ -1753,7 +1723,7 @@
             <w:noProof/>
             <w:webHidden/>
           </w:rPr>
-          <w:instrText xml:space="preserve"> PAGEREF _Toc242197361 \h </w:instrText>
+          <w:instrText xml:space="preserve"> PAGEREF _Toc242290542 \h </w:instrText>
         </w:r>
         <w:r>
           <w:rPr>
@@ -1800,7 +1770,7 @@
           <w14:ligatures w14:val="standardContextual"/>
         </w:rPr>
       </w:pPr>
-      <w:hyperlink w:anchor="_Toc242197362" w:history="1">
+      <w:hyperlink w:anchor="_Toc242290543" w:history="1">
         <w:r>
           <w:rPr>
             <w:rStyle w:val="Hyperlink"/>
@@ -1827,7 +1797,7 @@
             <w:noProof/>
             <w:webHidden/>
           </w:rPr>
-          <w:instrText xml:space="preserve"> PAGEREF _Toc242197362 \h </w:instrText>
+          <w:instrText xml:space="preserve"> PAGEREF _Toc242290543 \h </w:instrText>
         </w:r>
         <w:r>
           <w:rPr>
@@ -1874,7 +1844,7 @@
           <w14:ligatures w14:val="standardContextual"/>
         </w:rPr>
       </w:pPr>
-      <w:hyperlink w:anchor="_Toc242197363" w:history="1">
+      <w:hyperlink w:anchor="_Toc242290544" w:history="1">
         <w:r>
           <w:rPr>
             <w:rStyle w:val="Hyperlink"/>
@@ -1901,7 +1871,7 @@
             <w:noProof/>
             <w:webHidden/>
           </w:rPr>
-          <w:instrText xml:space="preserve"> PAGEREF _Toc242197363 \h </w:instrText>
+          <w:instrText xml:space="preserve"> PAGEREF _Toc242290544 \h </w:instrText>
         </w:r>
         <w:r>
           <w:rPr>
@@ -1948,7 +1918,7 @@
           <w14:ligatures w14:val="standardContextual"/>
         </w:rPr>
       </w:pPr>
-      <w:hyperlink w:anchor="_Toc242197364" w:history="1">
+      <w:hyperlink w:anchor="_Toc242290545" w:history="1">
         <w:r>
           <w:rPr>
             <w:rStyle w:val="Hyperlink"/>
@@ -1975,7 +1945,7 @@
             <w:noProof/>
             <w:webHidden/>
           </w:rPr>
-          <w:instrText xml:space="preserve"> PAGEREF _Toc242197364 \h </w:instrText>
+          <w:instrText xml:space="preserve"> PAGEREF _Toc242290545 \h </w:instrText>
         </w:r>
         <w:r>
           <w:rPr>
@@ -2022,7 +1992,7 @@
           <w14:ligatures w14:val="standardContextual"/>
         </w:rPr>
       </w:pPr>
-      <w:hyperlink w:anchor="_Toc242197365" w:history="1">
+      <w:hyperlink w:anchor="_Toc242290546" w:history="1">
         <w:r>
           <w:rPr>
             <w:rStyle w:val="Hyperlink"/>
@@ -2049,7 +2019,7 @@
             <w:noProof/>
             <w:webHidden/>
           </w:rPr>
-          <w:instrText xml:space="preserve"> PAGEREF _Toc242197365 \h </w:instrText>
+          <w:instrText xml:space="preserve"> PAGEREF _Toc242290546 \h </w:instrText>
         </w:r>
         <w:r>
           <w:rPr>
@@ -2096,7 +2066,7 @@
           <w14:ligatures w14:val="standardContextual"/>
         </w:rPr>
       </w:pPr>
-      <w:hyperlink w:anchor="_Toc242197366" w:history="1">
+      <w:hyperlink w:anchor="_Toc242290547" w:history="1">
         <w:r>
           <w:rPr>
             <w:rStyle w:val="Hyperlink"/>
@@ -2123,7 +2093,7 @@
             <w:noProof/>
             <w:webHidden/>
           </w:rPr>
-          <w:instrText xml:space="preserve"> PAGEREF _Toc242197366 \h </w:instrText>
+          <w:instrText xml:space="preserve"> PAGEREF _Toc242290547 \h </w:instrText>
         </w:r>
         <w:r>
           <w:rPr>
@@ -2170,7 +2140,7 @@
           <w14:ligatures w14:val="standardContextual"/>
         </w:rPr>
       </w:pPr>
-      <w:hyperlink w:anchor="_Toc242197367" w:history="1">
+      <w:hyperlink w:anchor="_Toc242290548" w:history="1">
         <w:r>
           <w:rPr>
             <w:rStyle w:val="Hyperlink"/>
@@ -2197,7 +2167,7 @@
             <w:noProof/>
             <w:webHidden/>
           </w:rPr>
-          <w:instrText xml:space="preserve"> PAGEREF _Toc242197367 \h </w:instrText>
+          <w:instrText xml:space="preserve"> PAGEREF _Toc242290548 \h </w:instrText>
         </w:r>
         <w:r>
           <w:rPr>
@@ -2244,7 +2214,7 @@
           <w14:ligatures w14:val="standardContextual"/>
         </w:rPr>
       </w:pPr>
-      <w:hyperlink w:anchor="_Toc242197368" w:history="1">
+      <w:hyperlink w:anchor="_Toc242290549" w:history="1">
         <w:r>
           <w:rPr>
             <w:rStyle w:val="Hyperlink"/>
@@ -2271,7 +2241,7 @@
             <w:noProof/>
             <w:webHidden/>
           </w:rPr>
-          <w:instrText xml:space="preserve"> PAGEREF _Toc242197368 \h </w:instrText>
+          <w:instrText xml:space="preserve"> PAGEREF _Toc242290549 \h </w:instrText>
         </w:r>
         <w:r>
           <w:rPr>
@@ -2318,7 +2288,7 @@
           <w14:ligatures w14:val="standardContextual"/>
         </w:rPr>
       </w:pPr>
-      <w:hyperlink w:anchor="_Toc242197369" w:history="1">
+      <w:hyperlink w:anchor="_Toc242290550" w:history="1">
         <w:r>
           <w:rPr>
             <w:rStyle w:val="Hyperlink"/>
@@ -2345,7 +2315,7 @@
             <w:noProof/>
             <w:webHidden/>
           </w:rPr>
-          <w:instrText xml:space="preserve"> PAGEREF _Toc242197369 \h </w:instrText>
+          <w:instrText xml:space="preserve"> PAGEREF _Toc242290550 \h </w:instrText>
         </w:r>
         <w:r>
           <w:rPr>
@@ -2392,7 +2362,7 @@
           <w14:ligatures w14:val="standardContextual"/>
         </w:rPr>
       </w:pPr>
-      <w:hyperlink w:anchor="_Toc242197370" w:history="1">
+      <w:hyperlink w:anchor="_Toc242290551" w:history="1">
         <w:r>
           <w:rPr>
             <w:rStyle w:val="Hyperlink"/>
@@ -2419,7 +2389,7 @@
             <w:noProof/>
             <w:webHidden/>
           </w:rPr>
-          <w:instrText xml:space="preserve"> PAGEREF _Toc242197370 \h </w:instrText>
+          <w:instrText xml:space="preserve"> PAGEREF _Toc242290551 \h </w:instrText>
         </w:r>
         <w:r>
           <w:rPr>
@@ -2466,7 +2436,7 @@
           <w14:ligatures w14:val="standardContextual"/>
         </w:rPr>
       </w:pPr>
-      <w:hyperlink w:anchor="_Toc242197371" w:history="1">
+      <w:hyperlink w:anchor="_Toc242290552" w:history="1">
         <w:r>
           <w:rPr>
             <w:rStyle w:val="Hyperlink"/>
@@ -2493,7 +2463,7 @@
             <w:noProof/>
             <w:webHidden/>
           </w:rPr>
-          <w:instrText xml:space="preserve"> PAGEREF _Toc242197371 \h </w:instrText>
+          <w:instrText xml:space="preserve"> PAGEREF _Toc242290552 \h </w:instrText>
         </w:r>
         <w:r>
           <w:rPr>
@@ -2540,7 +2510,7 @@
           <w14:ligatures w14:val="standardContextual"/>
         </w:rPr>
       </w:pPr>
-      <w:hyperlink w:anchor="_Toc242197372" w:history="1">
+      <w:hyperlink w:anchor="_Toc242290553" w:history="1">
         <w:r>
           <w:rPr>
             <w:rStyle w:val="Hyperlink"/>
@@ -2567,7 +2537,7 @@
             <w:noProof/>
             <w:webHidden/>
           </w:rPr>
-          <w:instrText xml:space="preserve"> PAGEREF _Toc242197372 \h </w:instrText>
+          <w:instrText xml:space="preserve"> PAGEREF _Toc242290553 \h </w:instrText>
         </w:r>
         <w:r>
           <w:rPr>
@@ -2614,7 +2584,7 @@
           <w14:ligatures w14:val="standardContextual"/>
         </w:rPr>
       </w:pPr>
-      <w:hyperlink w:anchor="_Toc242197373" w:history="1">
+      <w:hyperlink w:anchor="_Toc242290554" w:history="1">
         <w:r>
           <w:rPr>
             <w:rStyle w:val="Hyperlink"/>
@@ -2641,7 +2611,7 @@
             <w:noProof/>
             <w:webHidden/>
           </w:rPr>
-          <w:instrText xml:space="preserve"> PAGEREF _Toc242197373 \h </w:instrText>
+          <w:instrText xml:space="preserve"> PAGEREF _Toc242290554 \h </w:instrText>
         </w:r>
         <w:r>
           <w:rPr>
@@ -2688,7 +2658,7 @@
           <w14:ligatures w14:val="standardContextual"/>
         </w:rPr>
       </w:pPr>
-      <w:hyperlink w:anchor="_Toc242197374" w:history="1">
+      <w:hyperlink w:anchor="_Toc242290555" w:history="1">
         <w:r>
           <w:rPr>
             <w:rStyle w:val="Hyperlink"/>
@@ -2715,7 +2685,7 @@
             <w:noProof/>
             <w:webHidden/>
           </w:rPr>
-          <w:instrText xml:space="preserve"> PAGEREF _Toc242197374 \h </w:instrText>
+          <w:instrText xml:space="preserve"> PAGEREF _Toc242290555 \h </w:instrText>
         </w:r>
         <w:r>
           <w:rPr>
@@ -2762,7 +2732,7 @@
           <w14:ligatures w14:val="standardContextual"/>
         </w:rPr>
       </w:pPr>
-      <w:hyperlink w:anchor="_Toc242197375" w:history="1">
+      <w:hyperlink w:anchor="_Toc242290556" w:history="1">
         <w:r>
           <w:rPr>
             <w:rStyle w:val="Hyperlink"/>
@@ -2789,7 +2759,7 @@
             <w:noProof/>
             <w:webHidden/>
           </w:rPr>
-          <w:instrText xml:space="preserve"> PAGEREF _Toc242197375 \h </w:instrText>
+          <w:instrText xml:space="preserve"> PAGEREF _Toc242290556 \h </w:instrText>
         </w:r>
         <w:r>
           <w:rPr>
@@ -2836,7 +2806,7 @@
           <w14:ligatures w14:val="standardContextual"/>
         </w:rPr>
       </w:pPr>
-      <w:hyperlink w:anchor="_Toc242197376" w:history="1">
+      <w:hyperlink w:anchor="_Toc242290557" w:history="1">
         <w:r>
           <w:rPr>
             <w:rStyle w:val="Hyperlink"/>
@@ -2863,7 +2833,7 @@
             <w:noProof/>
             <w:webHidden/>
           </w:rPr>
-          <w:instrText xml:space="preserve"> PAGEREF _Toc242197376 \h </w:instrText>
+          <w:instrText xml:space="preserve"> PAGEREF _Toc242290557 \h </w:instrText>
         </w:r>
         <w:r>
           <w:rPr>
@@ -2910,7 +2880,7 @@
           <w14:ligatures w14:val="standardContextual"/>
         </w:rPr>
       </w:pPr>
-      <w:hyperlink w:anchor="_Toc242197377" w:history="1">
+      <w:hyperlink w:anchor="_Toc242290558" w:history="1">
         <w:r>
           <w:rPr>
             <w:rStyle w:val="Hyperlink"/>
@@ -2937,7 +2907,7 @@
             <w:noProof/>
             <w:webHidden/>
           </w:rPr>
-          <w:instrText xml:space="preserve"> PAGEREF _Toc242197377 \h </w:instrText>
+          <w:instrText xml:space="preserve"> PAGEREF _Toc242290558 \h </w:instrText>
         </w:r>
         <w:r>
           <w:rPr>
@@ -2984,7 +2954,7 @@
           <w14:ligatures w14:val="standardContextual"/>
         </w:rPr>
       </w:pPr>
-      <w:hyperlink w:anchor="_Toc242197378" w:history="1">
+      <w:hyperlink w:anchor="_Toc242290559" w:history="1">
         <w:r>
           <w:rPr>
             <w:rStyle w:val="Hyperlink"/>
@@ -3011,7 +2981,7 @@
             <w:noProof/>
             <w:webHidden/>
           </w:rPr>
-          <w:instrText xml:space="preserve"> PAGEREF _Toc242197378 \h </w:instrText>
+          <w:instrText xml:space="preserve"> PAGEREF _Toc242290559 \h </w:instrText>
         </w:r>
         <w:r>
           <w:rPr>
@@ -3058,7 +3028,7 @@
           <w14:ligatures w14:val="standardContextual"/>
         </w:rPr>
       </w:pPr>
-      <w:hyperlink w:anchor="_Toc242197379" w:history="1">
+      <w:hyperlink w:anchor="_Toc242290560" w:history="1">
         <w:r>
           <w:rPr>
             <w:rStyle w:val="Hyperlink"/>
@@ -3085,7 +3055,7 @@
             <w:noProof/>
             <w:webHidden/>
           </w:rPr>
-          <w:instrText xml:space="preserve"> PAGEREF _Toc242197379 \h </w:instrText>
+          <w:instrText xml:space="preserve"> PAGEREF _Toc242290560 \h </w:instrText>
         </w:r>
         <w:r>
           <w:rPr>
@@ -3132,7 +3102,7 @@
           <w14:ligatures w14:val="standardContextual"/>
         </w:rPr>
       </w:pPr>
-      <w:hyperlink w:anchor="_Toc242197380" w:history="1">
+      <w:hyperlink w:anchor="_Toc242290561" w:history="1">
         <w:r>
           <w:rPr>
             <w:rStyle w:val="Hyperlink"/>
@@ -3159,7 +3129,7 @@
             <w:noProof/>
             <w:webHidden/>
           </w:rPr>
-          <w:instrText xml:space="preserve"> PAGEREF _Toc242197380 \h </w:instrText>
+          <w:instrText xml:space="preserve"> PAGEREF _Toc242290561 \h </w:instrText>
         </w:r>
         <w:r>
           <w:rPr>
@@ -3206,7 +3176,7 @@
           <w14:ligatures w14:val="standardContextual"/>
         </w:rPr>
       </w:pPr>
-      <w:hyperlink w:anchor="_Toc242197381" w:history="1">
+      <w:hyperlink w:anchor="_Toc242290562" w:history="1">
         <w:r>
           <w:rPr>
             <w:rStyle w:val="Hyperlink"/>
@@ -3233,7 +3203,7 @@
             <w:noProof/>
             <w:webHidden/>
           </w:rPr>
-          <w:instrText xml:space="preserve"> PAGEREF _Toc242197381 \h </w:instrText>
+          <w:instrText xml:space="preserve"> PAGEREF _Toc242290562 \h </w:instrText>
         </w:r>
         <w:r>
           <w:rPr>
@@ -3278,7 +3248,7 @@
       <w:pPr>
         <w:pStyle w:val="Heading1"/>
       </w:pPr>
-      <w:bookmarkStart w:id="0" w:name="_Toc242197341"/>
+      <w:bookmarkStart w:id="0" w:name="_Toc242290522"/>
       <w:r>
         <w:lastRenderedPageBreak/>
         <w:t>1. Información general del producto</w:t>
@@ -3654,7 +3624,7 @@
               <w:rPr>
                 <w:sz w:val="19"/>
               </w:rPr>
-              <w:t>Funcional; validado con 10 semillas en diez experimentos y una ablación, con 36 pruebas automáticas y autoprueba del ejecutable.</w:t>
+              <w:t>Funcional. Validado con 10 semillas en diez experimentos y una ablación, con 36 pruebas automáticas y autoprueba del ejecutable.</w:t>
             </w:r>
           </w:p>
         </w:tc>
@@ -3696,7 +3666,7 @@
               <w:rPr>
                 <w:sz w:val="19"/>
               </w:rPr>
-              <w:t>Python 3.12.10; interfaz gráfica con tkinter.</w:t>
+              <w:t>Python 3.12.10. Interfaz gráfica con tkinter.</w:t>
             </w:r>
           </w:p>
         </w:tc>
@@ -3780,7 +3750,7 @@
               <w:rPr>
                 <w:sz w:val="19"/>
               </w:rPr>
-              <w:t>Ninguno específico; micrófono opcional para el modo voz.</w:t>
+              <w:t>Ninguno específico. Micrófono opcional para el modo voz.</w:t>
             </w:r>
           </w:p>
         </w:tc>
@@ -3838,48 +3808,6 @@
           </w:tcPr>
           <w:p>
             <w:pPr>
-              <w:keepNext/>
-              <w:spacing w:before="60" w:after="60"/>
-              <w:jc w:val="left"/>
-            </w:pPr>
-            <w:r>
-              <w:rPr>
-                <w:sz w:val="19"/>
-              </w:rPr>
-              <w:t>Repositorio de código fuente</w:t>
-            </w:r>
-          </w:p>
-        </w:tc>
-        <w:tc>
-          <w:tcPr>
-            <w:tcW w:w="6803" w:type="dxa"/>
-          </w:tcPr>
-          <w:p>
-            <w:pPr>
-              <w:keepNext/>
-              <w:spacing w:before="60" w:after="60"/>
-              <w:jc w:val="left"/>
-            </w:pPr>
-            <w:r>
-              <w:rPr>
-                <w:sz w:val="19"/>
-              </w:rPr>
-              <w:t>https://github.com/fjburgosf/VoxControlResearch</w:t>
-            </w:r>
-          </w:p>
-        </w:tc>
-      </w:tr>
-      <w:tr>
-        <w:trPr>
-          <w:cantSplit/>
-          <w:jc w:val="center"/>
-        </w:trPr>
-        <w:tc>
-          <w:tcPr>
-            <w:tcW w:w="2835" w:type="dxa"/>
-          </w:tcPr>
-          <w:p>
-            <w:pPr>
               <w:spacing w:before="60" w:after="60"/>
               <w:jc w:val="left"/>
             </w:pPr>
@@ -3915,7 +3843,7 @@
       <w:pPr>
         <w:pStyle w:val="Heading1"/>
       </w:pPr>
-      <w:bookmarkStart w:id="1" w:name="_Toc242197342"/>
+      <w:bookmarkStart w:id="1" w:name="_Toc242290523"/>
       <w:r>
         <w:t>2. Descripción general del software</w:t>
       </w:r>
@@ -3933,7 +3861,7 @@
       <w:pPr>
         <w:pStyle w:val="Heading2"/>
       </w:pPr>
-      <w:bookmarkStart w:id="2" w:name="_Toc242197343"/>
+      <w:bookmarkStart w:id="2" w:name="_Toc242290524"/>
       <w:r>
         <w:t>2.1 Especificación de requisitos de hardware y software</w:t>
       </w:r>
@@ -3943,7 +3871,7 @@
       <w:pPr>
         <w:pStyle w:val="Heading3"/>
       </w:pPr>
-      <w:bookmarkStart w:id="3" w:name="_Toc242197344"/>
+      <w:bookmarkStart w:id="3" w:name="_Toc242290525"/>
       <w:r>
         <w:t>Requisitos para el usuario final</w:t>
       </w:r>
@@ -3958,7 +3886,7 @@
       <w:pPr>
         <w:pStyle w:val="Heading3"/>
       </w:pPr>
-      <w:bookmarkStart w:id="4" w:name="_Toc242197345"/>
+      <w:bookmarkStart w:id="4" w:name="_Toc242290526"/>
       <w:r>
         <w:lastRenderedPageBreak/>
         <w:t>Entorno de software en modo desarrollo</w:t>
@@ -3967,14 +3895,14 @@
     </w:p>
     <w:p>
       <w:r>
-        <w:t>Python 3.12.10, NumPy 2.5.2, SciPy 1.18.1, scikit-learn 1.9.1, Matplotlib 3.11.2, PyYAML y faster-whisper; pytest para las pruebas y PyInstaller para el ejecutable.</w:t>
+        <w:t>Python 3.12.10, NumPy 2.5.2, SciPy 1.18.1, scikit-learn 1.9.1, Matplotlib 3.11.2, PyYAML y faster-whisper. Pytest para las pruebas y PyInstaller para el ejecutable.</w:t>
       </w:r>
     </w:p>
     <w:p>
       <w:pPr>
         <w:pStyle w:val="Heading3"/>
       </w:pPr>
-      <w:bookmarkStart w:id="5" w:name="_Toc242197346"/>
+      <w:bookmarkStart w:id="5" w:name="_Toc242290527"/>
       <w:r>
         <w:t>Requisito de operación sin red</w:t>
       </w:r>
@@ -3989,7 +3917,7 @@
       <w:pPr>
         <w:pStyle w:val="Heading2"/>
       </w:pPr>
-      <w:bookmarkStart w:id="6" w:name="_Toc242197347"/>
+      <w:bookmarkStart w:id="6" w:name="_Toc242290528"/>
       <w:r>
         <w:t>2.2 Justificación de los requisitos</w:t>
       </w:r>
@@ -4004,7 +3932,7 @@
       <w:pPr>
         <w:pStyle w:val="Heading1"/>
       </w:pPr>
-      <w:bookmarkStart w:id="7" w:name="_Toc242197348"/>
+      <w:bookmarkStart w:id="7" w:name="_Toc242290529"/>
       <w:r>
         <w:t>3. Objetivos y área de aplicación</w:t>
       </w:r>
@@ -4014,7 +3942,7 @@
       <w:pPr>
         <w:pStyle w:val="Heading2"/>
       </w:pPr>
-      <w:bookmarkStart w:id="8" w:name="_Toc242197349"/>
+      <w:bookmarkStart w:id="8" w:name="_Toc242290530"/>
       <w:r>
         <w:t>3.1 Objetivo general</w:t>
       </w:r>
@@ -4029,7 +3957,7 @@
       <w:pPr>
         <w:pStyle w:val="Heading2"/>
       </w:pPr>
-      <w:bookmarkStart w:id="9" w:name="_Toc242197350"/>
+      <w:bookmarkStart w:id="9" w:name="_Toc242290531"/>
       <w:r>
         <w:t>3.2 Área de aplicación</w:t>
       </w:r>
@@ -4044,7 +3972,7 @@
       <w:pPr>
         <w:pStyle w:val="Heading1"/>
       </w:pPr>
-      <w:bookmarkStart w:id="10" w:name="_Toc242197351"/>
+      <w:bookmarkStart w:id="10" w:name="_Toc242290532"/>
       <w:r>
         <w:t>4. Funcionalidades principales</w:t>
       </w:r>
@@ -4095,7 +4023,7 @@
         <w:pStyle w:val="ListBullet"/>
       </w:pPr>
       <w:r>
-        <w:t>Reconocimiento de voz local con incertidumbre por palabra; degradaciones de audio controladas.</w:t>
+        <w:t>Reconocimiento de voz local con incertidumbre por palabra. Degradaciones de audio controladas.</w:t>
       </w:r>
     </w:p>
     <w:p>
@@ -4111,14 +4039,14 @@
         <w:pStyle w:val="ListBullet"/>
       </w:pPr>
       <w:r>
-        <w:t>Interfaz bilingüe con menú de ejemplos, tutorial interactivo, resultados y exportación; CLI y API.</w:t>
+        <w:t>Interfaz bilingüe con menú de ejemplos, tutorial interactivo, resultados y exportación. CLI y API.</w:t>
       </w:r>
     </w:p>
     <w:p>
       <w:pPr>
         <w:pStyle w:val="Heading1"/>
       </w:pPr>
-      <w:bookmarkStart w:id="11" w:name="_Toc242197352"/>
+      <w:bookmarkStart w:id="11" w:name="_Toc242290533"/>
       <w:r>
         <w:lastRenderedPageBreak/>
         <w:t>5. Adaptabilidad, extensibilidad y mantenibilidad</w:t>
@@ -4129,7 +4057,7 @@
       <w:pPr>
         <w:pStyle w:val="Heading3"/>
       </w:pPr>
-      <w:bookmarkStart w:id="12" w:name="_Toc242197353"/>
+      <w:bookmarkStart w:id="12" w:name="_Toc242290534"/>
       <w:r>
         <w:t>Modularidad</w:t>
       </w:r>
@@ -4137,14 +4065,14 @@
     </w:p>
     <w:p>
       <w:r>
-        <w:t>Cada capa (datos, modelos, incertidumbre, OOD, calibración, decisión, adaptación, slots, sandbox, experimentos, interfaz) es un paquete con interfaz propia; UCIL activa o desactiva cada componente por configuración.</w:t>
+        <w:t>Cada capa (datos, modelos, incertidumbre, OOD, calibración, decisión, adaptación, slots, sandbox, experimentos, interfaz) es un paquete con interfaz propia. UCIL activa o desactiva cada componente por configuración.</w:t>
       </w:r>
     </w:p>
     <w:p>
       <w:pPr>
         <w:pStyle w:val="Heading3"/>
       </w:pPr>
-      <w:bookmarkStart w:id="13" w:name="_Toc242197354"/>
+      <w:bookmarkStart w:id="13" w:name="_Toc242290535"/>
       <w:r>
         <w:t>Incorporación de nuevas intenciones y modelos</w:t>
       </w:r>
@@ -4152,14 +4080,14 @@
     </w:p>
     <w:p>
       <w:r>
-        <w:t>Una intención nueva se agrega al archivo intents.yaml; un modelo nuevo implementa la interfaz IntentModel (fit, logits, predict_proba, update, embed); un detector OOD nuevo solo necesita un método de puntaje.</w:t>
+        <w:t>Una intención nueva se agrega al archivo intents.yaml. Un modelo nuevo implementa la interfaz IntentModel (fit, logits, predict_proba, update, embed). Un detector OOD nuevo solo necesita un método de puntaje.</w:t>
       </w:r>
     </w:p>
     <w:p>
       <w:pPr>
         <w:pStyle w:val="Heading3"/>
       </w:pPr>
-      <w:bookmarkStart w:id="14" w:name="_Toc242197355"/>
+      <w:bookmarkStart w:id="14" w:name="_Toc242290536"/>
       <w:r>
         <w:t>Configuración y parametrización</w:t>
       </w:r>
@@ -4174,7 +4102,7 @@
       <w:pPr>
         <w:pStyle w:val="Heading3"/>
       </w:pPr>
-      <w:bookmarkStart w:id="15" w:name="_Toc242197356"/>
+      <w:bookmarkStart w:id="15" w:name="_Toc242290537"/>
       <w:r>
         <w:t>Facilidad de mantenimiento</w:t>
       </w:r>
@@ -4189,7 +4117,7 @@
       <w:pPr>
         <w:pStyle w:val="Heading1"/>
       </w:pPr>
-      <w:bookmarkStart w:id="16" w:name="_Toc242197357"/>
+      <w:bookmarkStart w:id="16" w:name="_Toc242290538"/>
       <w:r>
         <w:t>6. Robustez, desempeño y consistencia</w:t>
       </w:r>
@@ -4199,7 +4127,7 @@
       <w:pPr>
         <w:pStyle w:val="Heading2"/>
       </w:pPr>
-      <w:bookmarkStart w:id="17" w:name="_Toc242197358"/>
+      <w:bookmarkStart w:id="17" w:name="_Toc242290539"/>
       <w:r>
         <w:t>6.1 Robustez</w:t>
       </w:r>
@@ -4214,7 +4142,7 @@
       <w:pPr>
         <w:pStyle w:val="Heading2"/>
       </w:pPr>
-      <w:bookmarkStart w:id="18" w:name="_Toc242197359"/>
+      <w:bookmarkStart w:id="18" w:name="_Toc242290540"/>
       <w:r>
         <w:t>6.2 Desempeño</w:t>
       </w:r>
@@ -4229,7 +4157,7 @@
       <w:pPr>
         <w:pStyle w:val="Heading2"/>
       </w:pPr>
-      <w:bookmarkStart w:id="19" w:name="_Toc242197360"/>
+      <w:bookmarkStart w:id="19" w:name="_Toc242290541"/>
       <w:r>
         <w:t>6.3 Consistencia y reproducibilidad</w:t>
       </w:r>
@@ -4237,14 +4165,14 @@
     </w:p>
     <w:p>
       <w:r>
-        <w:t>Con la misma configuración y semilla, las tablas resultantes son idénticas; el ejecutable produce los mismos resultados que el código fuente. Cada corrida guarda su configuración, versiones y semillas.</w:t>
+        <w:t>Con la misma configuración y semilla, las tablas resultantes son idénticas. El ejecutable produce los mismos resultados que el código fuente. Cada corrida guarda su configuración, versiones y semillas.</w:t>
       </w:r>
     </w:p>
     <w:p>
       <w:pPr>
         <w:pStyle w:val="Heading1"/>
       </w:pPr>
-      <w:bookmarkStart w:id="20" w:name="_Toc242197361"/>
+      <w:bookmarkStart w:id="20" w:name="_Toc242290542"/>
       <w:r>
         <w:t>7. Interfaz y usabilidad</w:t>
       </w:r>
@@ -4266,7 +4194,7 @@
         </w:rPr>
         <w:lastRenderedPageBreak/>
         <w:drawing>
-          <wp:inline distT="0" distB="0" distL="0" distR="0" wp14:anchorId="425F565A" wp14:editId="5E8090A3">
+          <wp:inline distT="0" distB="0" distL="0" distR="0" wp14:anchorId="5842C175" wp14:editId="14048F02">
             <wp:extent cx="5580000" cy="3833299"/>
             <wp:effectExtent l="0" t="0" r="0" b="0"/>
             <wp:docPr id="1" name="Picture 1"/>
@@ -4322,7 +4250,7 @@
       <w:pPr>
         <w:pStyle w:val="Heading1"/>
       </w:pPr>
-      <w:bookmarkStart w:id="21" w:name="_Toc242197362"/>
+      <w:bookmarkStart w:id="21" w:name="_Toc242290543"/>
       <w:r>
         <w:t>8. Integridad y seguridad de la información</w:t>
       </w:r>
@@ -4330,14 +4258,14 @@
     </w:p>
     <w:p>
       <w:r>
-        <w:t>El procesamiento es local. El audio del micrófono no se guarda. Las acciones se aplican solo a un escritorio simulado y a una lista blanca de intenciones con slots validados; ninguna orden se convierte en comandos del sistema. Los resultados se guardan con su configuración y metadatos para su trazabilidad.</w:t>
+        <w:t>El procesamiento es local. El audio del micrófono no se guarda. Las acciones se aplican solo a un escritorio simulado y a una lista blanca de intenciones con slots validados. Ninguna orden se convierte en comandos del sistema. Los resultados se guardan con su configuración y metadatos para su trazabilidad.</w:t>
       </w:r>
     </w:p>
     <w:p>
       <w:pPr>
         <w:pStyle w:val="Heading1"/>
       </w:pPr>
-      <w:bookmarkStart w:id="22" w:name="_Toc242197363"/>
+      <w:bookmarkStart w:id="22" w:name="_Toc242290544"/>
       <w:r>
         <w:t>9. Portabilidad y compatibilidad</w:t>
       </w:r>
@@ -4347,7 +4275,7 @@
       <w:pPr>
         <w:pStyle w:val="Heading2"/>
       </w:pPr>
-      <w:bookmarkStart w:id="23" w:name="_Toc242197364"/>
+      <w:bookmarkStart w:id="23" w:name="_Toc242290545"/>
       <w:r>
         <w:t>9.1 Plataformas compatibles</w:t>
       </w:r>
@@ -4355,14 +4283,14 @@
     </w:p>
     <w:p>
       <w:r>
-        <w:t>Windows 10 y 11 de 64 bits como aplicación empaquetada; el código fuente es Python estándar.</w:t>
+        <w:t>Windows 10 y 11 de 64 bits como aplicación empaquetada. El código fuente es Python estándar.</w:t>
       </w:r>
     </w:p>
     <w:p>
       <w:pPr>
         <w:pStyle w:val="Heading2"/>
       </w:pPr>
-      <w:bookmarkStart w:id="24" w:name="_Toc242197365"/>
+      <w:bookmarkStart w:id="24" w:name="_Toc242290546"/>
       <w:r>
         <w:t>9.2 Dependencias relevantes</w:t>
       </w:r>
@@ -4377,7 +4305,7 @@
       <w:pPr>
         <w:pStyle w:val="Heading2"/>
       </w:pPr>
-      <w:bookmarkStart w:id="25" w:name="_Toc242197366"/>
+      <w:bookmarkStart w:id="25" w:name="_Toc242290547"/>
       <w:r>
         <w:t>9.3 Portabilidad</w:t>
       </w:r>
@@ -4385,14 +4313,14 @@
     </w:p>
     <w:p>
       <w:r>
-        <w:t>La aplicación se distribuye como carpeta comprimida, no requiere instalación ni escribe en AppData; sus rutas internas no superan 120 caracteres.</w:t>
+        <w:t>La aplicación se distribuye como carpeta comprimida, no requiere instalación ni escribe en AppData. Sus rutas internas no superan 120 caracteres.</w:t>
       </w:r>
     </w:p>
     <w:p>
       <w:pPr>
         <w:pStyle w:val="Heading1"/>
       </w:pPr>
-      <w:bookmarkStart w:id="26" w:name="_Toc242197367"/>
+      <w:bookmarkStart w:id="26" w:name="_Toc242290548"/>
       <w:r>
         <w:lastRenderedPageBreak/>
         <w:t>10. Documentación y soporte técnico</w:t>
@@ -4408,7 +4336,7 @@
       <w:pPr>
         <w:pStyle w:val="Heading3"/>
       </w:pPr>
-      <w:bookmarkStart w:id="27" w:name="_Toc242197368"/>
+      <w:bookmarkStart w:id="27" w:name="_Toc242290549"/>
       <w:r>
         <w:t>Soporte técnico</w:t>
       </w:r>
@@ -4423,7 +4351,7 @@
       <w:pPr>
         <w:pStyle w:val="Heading1"/>
       </w:pPr>
-      <w:bookmarkStart w:id="28" w:name="_Toc242197369"/>
+      <w:bookmarkStart w:id="28" w:name="_Toc242290550"/>
       <w:r>
         <w:t>11. Pruebas, validación y desempeño</w:t>
       </w:r>
@@ -4946,10 +4874,10 @@
     <w:p/>
     <w:p>
       <w:r>
-        <w:t>Frente a B3, UCIL redujo el costo medio en todas las semillas (-0.039 [-0.070, -0.007], d_z = -0.87, 10/10 semillas a favor de UCIL); frente a B4 la diferencia en datos limpios no fue concluyente (-0.046 [-0.121, 0.029], d_z = -0.44, 4/10 semillas a favor de UCIL) y bajo cambio combinado fue -0.063 [-0.084, -0.043], d_z = -2.22, 10/10 semillas a favor de UCIL. UCIL ejecutó más órdenes de bajo riesgo erróneas que B3 y B4 y ninguna de riesgo alto. La capa de calibración y el enrutamiento por riesgo no redujer</w:t>
+        <w:t>Frente a B3, UCIL redujo el costo medio en todas las semillas (-0.039 [-0.070, -0.007], d_z = -0.87, 10/10 semillas a favor de UCIL). Frente a B4 la diferencia en datos limpios no fue concluyente (-0.046 [-0.121, 0.029], d_z = -0.44, 4/10 semillas a favor de UCIL) y bajo cambio combinado fue -0.063 [-0.084, -0.043], d_z = -2.22, 10/10 semillas a favor de UCIL. UCIL ejecutó más órdenes de bajo riesgo erróneas que B3 y B4 y ninguna de riesgo alto. La capa de calibración y el enrutamiento por riesgo no redujer</w:t>
       </w:r>
       <w:r>
-        <w:t>on el costo medio en la ablación; la detección OOD y la adaptación sí aportaron.</w:t>
+        <w:t>on el costo medio en la ablación. La detección OOD y la adaptación sí aportaron.</w:t>
       </w:r>
     </w:p>
     <w:p>
@@ -4962,7 +4890,7 @@
           <w:noProof/>
         </w:rPr>
         <w:drawing>
-          <wp:inline distT="0" distB="0" distL="0" distR="0" wp14:anchorId="0539A42C" wp14:editId="0F5BCF21">
+          <wp:inline distT="0" distB="0" distL="0" distR="0" wp14:anchorId="0DEEE99D" wp14:editId="2184F41E">
             <wp:extent cx="5580000" cy="2266875"/>
             <wp:effectExtent l="0" t="0" r="0" b="0"/>
             <wp:docPr id="2" name="Picture 2"/>
@@ -5018,7 +4946,7 @@
       <w:pPr>
         <w:pStyle w:val="Heading1"/>
       </w:pPr>
-      <w:bookmarkStart w:id="29" w:name="_Toc242197370"/>
+      <w:bookmarkStart w:id="29" w:name="_Toc242290551"/>
       <w:r>
         <w:lastRenderedPageBreak/>
         <w:t>12. Impacto y utilización</w:t>
@@ -5029,7 +4957,7 @@
       <w:pPr>
         <w:pStyle w:val="Heading2"/>
       </w:pPr>
-      <w:bookmarkStart w:id="30" w:name="_Toc242197371"/>
+      <w:bookmarkStart w:id="30" w:name="_Toc242290552"/>
       <w:r>
         <w:t>12.1 Impacto en docencia</w:t>
       </w:r>
@@ -5044,7 +4972,7 @@
       <w:pPr>
         <w:pStyle w:val="Heading2"/>
       </w:pPr>
-      <w:bookmarkStart w:id="31" w:name="_Toc242197372"/>
+      <w:bookmarkStart w:id="31" w:name="_Toc242290553"/>
       <w:r>
         <w:t>12.2 Impacto en investigación</w:t>
       </w:r>
@@ -5059,7 +4987,7 @@
       <w:pPr>
         <w:pStyle w:val="Heading2"/>
       </w:pPr>
-      <w:bookmarkStart w:id="32" w:name="_Toc242197373"/>
+      <w:bookmarkStart w:id="32" w:name="_Toc242290554"/>
       <w:r>
         <w:t>12.3 Impacto en extensión</w:t>
       </w:r>
@@ -5067,14 +4995,14 @@
     </w:p>
     <w:p>
       <w:r>
-        <w:t>El modo de ejecución con confirmación obligatoria para acciones de riesgo alto y el escritorio simulado permiten mostrar a usuarios no especialistas cómo un sistema de voz puede pedir confirmación en lugar de equivocarse; no se han realizado actividades de extensión con el software.</w:t>
+        <w:t>El modo de ejecución con confirmación obligatoria para acciones de riesgo alto y el escritorio simulado permiten mostrar a usuarios no especialistas cómo un sistema de voz puede pedir confirmación en lugar de equivocarse. No se han realizado actividades de extensión con el software.</w:t>
       </w:r>
     </w:p>
     <w:p>
       <w:pPr>
         <w:pStyle w:val="Heading2"/>
       </w:pPr>
-      <w:bookmarkStart w:id="33" w:name="_Toc242197374"/>
+      <w:bookmarkStart w:id="33" w:name="_Toc242290555"/>
       <w:r>
         <w:t>12.4 Usuarios y utilización</w:t>
       </w:r>
@@ -5089,7 +5017,7 @@
       <w:pPr>
         <w:pStyle w:val="Heading1"/>
       </w:pPr>
-      <w:bookmarkStart w:id="34" w:name="_Toc242197375"/>
+      <w:bookmarkStart w:id="34" w:name="_Toc242290556"/>
       <w:r>
         <w:t>13. Contribución al estado del arte</w:t>
       </w:r>
@@ -5099,7 +5027,7 @@
       <w:pPr>
         <w:pStyle w:val="Heading2"/>
       </w:pPr>
-      <w:bookmarkStart w:id="35" w:name="_Toc242197376"/>
+      <w:bookmarkStart w:id="35" w:name="_Toc242290557"/>
       <w:r>
         <w:t>13.1 Problema abordado</w:t>
       </w:r>
@@ -5114,7 +5042,7 @@
       <w:pPr>
         <w:pStyle w:val="Heading2"/>
       </w:pPr>
-      <w:bookmarkStart w:id="36" w:name="_Toc242197377"/>
+      <w:bookmarkStart w:id="36" w:name="_Toc242290558"/>
       <w:r>
         <w:t>13.2 Estado del arte</w:t>
       </w:r>
@@ -5122,7 +5050,7 @@
     </w:p>
     <w:p>
       <w:r>
-        <w:t>La comprensión del lenguaje hablado combina el reconocimiento del habla con la clasificación de la intención y la extracción de slots (Tur y De Mori, 2011); reconocedores actuales como Whisper (Radford et al., 2023) ofrecen transcripción robusta y probabilidades por palabra. En clasificación, Guo et al. (2017) mostraron que las redes modernas suelen estar mal calibradas y que el escalado por temperatura corrige buena parte del problema; otras formas de calibración son el escalado de Platt (Platt, 1999) y la</w:t>
+        <w:t>La comprensión del lenguaje hablado combina el reconocimiento del habla con la clasificación de la intención y la extracción de slots (Tur y De Mori, 2011). Reconocedores actuales como Whisper (Radford et al., 2023) ofrecen transcripción robusta y probabilidades por palabra. En clasificación, Guo et al. (2017) mostraron que las redes modernas suelen estar mal calibradas y que el escalado por temperatura corrige buena parte del problema. Otras formas de calibración son el escalado de Platt (Platt, 1999) y la</w:t>
       </w:r>
       <w:r>
         <w:t xml:space="preserve"> regresión isotónica (Zadrozny y Elkan, 2002), y el error de calibración esperado se usa para medirla (Naeini et al., 2015). La predicción selectiva, que permite abstenerse cuando el riesgo es alto, parte del compromiso entre error y rechazo de Chow (1970) y fue formulada para redes profundas por Geifman y El-Yaniv (2017). Para detectar entradas fuera de distribución se han propuesto la probabilidad máxima del softmax (Hendrycks y Gimpel, 2017), la distancia de Mahalanobis (Lee et al., 2018), la energía (Li</w:t>
@@ -5132,14 +5060,14 @@
       </w:r>
       <w:r>
         <w:lastRenderedPageBreak/>
-        <w:t>cercanos (Sun et al., 2022); Larson et al. (2019) publicaron un conjunto de datos de intención con consultas fuera de alcance. Los ensambles proporcionan estimaciones de incertidumbre (Lakshminarayanan et al., 2017). En aprendizaje continuo, el olvido catastrófico (Kirkpatrick et al., 2017) se mitiga con regularización o con memorias de ejemplos y prototipos (Rebuffi et al., 2017).</w:t>
+        <w:t>cercanos (Sun et al., 2022). Larson et al. (2019) publicaron un conjunto de datos de intención con consultas fuera de alcance. Los ensambles proporcionan estimaciones de incertidumbre (Lakshminarayanan et al., 2017). En aprendizaje continuo, el olvido catastrófico (Kirkpatrick et al., 2017) se mitiga con regularización o con memorias de ejemplos y prototipos (Rebuffi et al., 2017).</w:t>
       </w:r>
     </w:p>
     <w:p>
       <w:pPr>
         <w:pStyle w:val="Heading2"/>
       </w:pPr>
-      <w:bookmarkStart w:id="37" w:name="_Toc242197378"/>
+      <w:bookmarkStart w:id="37" w:name="_Toc242290559"/>
       <w:r>
         <w:t>13.3 Limitaciones actuales del estado del arte</w:t>
       </w:r>
@@ -5147,14 +5075,14 @@
     </w:p>
     <w:p>
       <w:r>
-        <w:t>En las referencias citadas estos elementos se estudian por separado: la calibración y la detección fuera de distribución se evalúan sobre la clasificación sin considerar el costo de la acción que se ejecuta; la abstención suele ser binaria (aceptar o rechazar), sin la opción intermedia de pedir confirmación; y la adaptación al usuario se evalúa sin medir su efecto sobre la decisión de ejecutar. Esta observación se basa en las referencias listadas y no en una revisión sistemática de la literatura.</w:t>
+        <w:t>En las referencias citadas estos elementos se estudian por separado: la calibración y la detección fuera de distribución se evalúan sobre la clasificación sin considerar el costo de la acción que se ejecuta. La abstención suele ser binaria (aceptar o rechazar), sin la opción intermedia de pedir confirmación, y la adaptación al usuario se evalúa sin medir su efecto sobre la decisión de ejecutar. Esta observación se basa en las referencias listadas y no en una revisión sistemática de la literatura.</w:t>
       </w:r>
     </w:p>
     <w:p>
       <w:pPr>
         <w:pStyle w:val="Heading2"/>
       </w:pPr>
-      <w:bookmarkStart w:id="38" w:name="_Toc242197379"/>
+      <w:bookmarkStart w:id="38" w:name="_Toc242290560"/>
       <w:r>
         <w:t>13.4 Impacto de VoxControlResearch sobre el estado del arte</w:t>
       </w:r>
@@ -5172,7 +5100,7 @@
       <w:pPr>
         <w:pStyle w:val="Heading1"/>
       </w:pPr>
-      <w:bookmarkStart w:id="39" w:name="_Toc242197380"/>
+      <w:bookmarkStart w:id="39" w:name="_Toc242290561"/>
       <w:r>
         <w:t>14. Aportes del autor</w:t>
       </w:r>
@@ -5235,7 +5163,7 @@
       <w:pPr>
         <w:pStyle w:val="Heading1"/>
       </w:pPr>
-      <w:bookmarkStart w:id="40" w:name="_Toc242197381"/>
+      <w:bookmarkStart w:id="40" w:name="_Toc242290562"/>
       <w:r>
         <w:t>Referencias</w:t>
       </w:r>
@@ -5520,31 +5448,31 @@
       </w:rPr>
     </w:lvl>
   </w:abstractNum>
-  <w:num w:numId="1" w16cid:durableId="2103992063">
+  <w:num w:numId="1" w16cid:durableId="1902056357">
     <w:abstractNumId w:val="8"/>
   </w:num>
-  <w:num w:numId="2" w16cid:durableId="196163332">
+  <w:num w:numId="2" w16cid:durableId="1489518908">
     <w:abstractNumId w:val="6"/>
   </w:num>
-  <w:num w:numId="3" w16cid:durableId="1469302">
+  <w:num w:numId="3" w16cid:durableId="533422604">
     <w:abstractNumId w:val="5"/>
   </w:num>
-  <w:num w:numId="4" w16cid:durableId="849175406">
+  <w:num w:numId="4" w16cid:durableId="1461144360">
     <w:abstractNumId w:val="4"/>
   </w:num>
-  <w:num w:numId="5" w16cid:durableId="1735859627">
+  <w:num w:numId="5" w16cid:durableId="140000052">
     <w:abstractNumId w:val="7"/>
   </w:num>
-  <w:num w:numId="6" w16cid:durableId="1952085998">
+  <w:num w:numId="6" w16cid:durableId="1540047486">
     <w:abstractNumId w:val="3"/>
   </w:num>
-  <w:num w:numId="7" w16cid:durableId="359011103">
+  <w:num w:numId="7" w16cid:durableId="253559702">
     <w:abstractNumId w:val="2"/>
   </w:num>
-  <w:num w:numId="8" w16cid:durableId="230772578">
+  <w:num w:numId="8" w16cid:durableId="1328054162">
     <w:abstractNumId w:val="1"/>
   </w:num>
-  <w:num w:numId="9" w16cid:durableId="94137135">
+  <w:num w:numId="9" w16cid:durableId="1165240406">
     <w:abstractNumId w:val="0"/>
   </w:num>
 </w:numbering>
@@ -16945,7 +16873,7 @@
     <w:autoRedefine/>
     <w:uiPriority w:val="39"/>
     <w:unhideWhenUsed/>
-    <w:rsid w:val="00A75E26"/>
+    <w:rsid w:val="00E929DA"/>
     <w:pPr>
       <w:spacing w:after="100"/>
     </w:pPr>
@@ -16957,7 +16885,7 @@
     <w:autoRedefine/>
     <w:uiPriority w:val="39"/>
     <w:unhideWhenUsed/>
-    <w:rsid w:val="00A75E26"/>
+    <w:rsid w:val="00E929DA"/>
     <w:pPr>
       <w:spacing w:after="100"/>
       <w:ind w:left="220"/>
@@ -16970,7 +16898,7 @@
     <w:autoRedefine/>
     <w:uiPriority w:val="39"/>
     <w:unhideWhenUsed/>
-    <w:rsid w:val="00A75E26"/>
+    <w:rsid w:val="00E929DA"/>
     <w:pPr>
       <w:spacing w:after="100"/>
       <w:ind w:left="440"/>
@@ -16981,7 +16909,7 @@
     <w:basedOn w:val="DefaultParagraphFont"/>
     <w:uiPriority w:val="99"/>
     <w:unhideWhenUsed/>
-    <w:rsid w:val="00A75E26"/>
+    <w:rsid w:val="00E929DA"/>
     <w:rPr>
       <w:color w:val="0000FF" w:themeColor="hyperlink"/>
       <w:u w:val="single"/>

</xml_diff>

<commit_message>
Correcciones de seguridad, persistencia y reproducibilidad tras revisión
</commit_message>
<xml_diff>
--- a/manuales/Descripcion_del_Software_VoxControlResearch.docx
+++ b/manuales/Descripcion_del_Software_VoxControlResearch.docx
@@ -139,7 +139,7 @@
               <w:rPr>
                 <w:sz w:val="19"/>
               </w:rPr>
-              <w:t>2026-10-07</w:t>
+              <w:t>2026-10-08</w:t>
             </w:r>
           </w:p>
         </w:tc>
@@ -216,7 +216,7 @@
       <w:r>
         <w:fldChar w:fldCharType="separate"/>
       </w:r>
-      <w:hyperlink w:anchor="_Toc242290522" w:history="1">
+      <w:hyperlink w:anchor="_Toc242346795" w:history="1">
         <w:r>
           <w:rPr>
             <w:rStyle w:val="Hyperlink"/>
@@ -243,7 +243,7 @@
             <w:noProof/>
             <w:webHidden/>
           </w:rPr>
-          <w:instrText xml:space="preserve"> PAGEREF _Toc242290522 \h </w:instrText>
+          <w:instrText xml:space="preserve"> PAGEREF _Toc242346795 \h </w:instrText>
         </w:r>
         <w:r>
           <w:rPr>
@@ -290,7 +290,7 @@
           <w14:ligatures w14:val="standardContextual"/>
         </w:rPr>
       </w:pPr>
-      <w:hyperlink w:anchor="_Toc242290523" w:history="1">
+      <w:hyperlink w:anchor="_Toc242346796" w:history="1">
         <w:r>
           <w:rPr>
             <w:rStyle w:val="Hyperlink"/>
@@ -317,7 +317,7 @@
             <w:noProof/>
             <w:webHidden/>
           </w:rPr>
-          <w:instrText xml:space="preserve"> PAGEREF _Toc242290523 \h </w:instrText>
+          <w:instrText xml:space="preserve"> PAGEREF _Toc242346796 \h </w:instrText>
         </w:r>
         <w:r>
           <w:rPr>
@@ -364,7 +364,7 @@
           <w14:ligatures w14:val="standardContextual"/>
         </w:rPr>
       </w:pPr>
-      <w:hyperlink w:anchor="_Toc242290524" w:history="1">
+      <w:hyperlink w:anchor="_Toc242346797" w:history="1">
         <w:r>
           <w:rPr>
             <w:rStyle w:val="Hyperlink"/>
@@ -391,7 +391,7 @@
             <w:noProof/>
             <w:webHidden/>
           </w:rPr>
-          <w:instrText xml:space="preserve"> PAGEREF _Toc242290524 \h </w:instrText>
+          <w:instrText xml:space="preserve"> PAGEREF _Toc242346797 \h </w:instrText>
         </w:r>
         <w:r>
           <w:rPr>
@@ -438,7 +438,7 @@
           <w14:ligatures w14:val="standardContextual"/>
         </w:rPr>
       </w:pPr>
-      <w:hyperlink w:anchor="_Toc242290525" w:history="1">
+      <w:hyperlink w:anchor="_Toc242346798" w:history="1">
         <w:r>
           <w:rPr>
             <w:rStyle w:val="Hyperlink"/>
@@ -465,7 +465,7 @@
             <w:noProof/>
             <w:webHidden/>
           </w:rPr>
-          <w:instrText xml:space="preserve"> PAGEREF _Toc242290525 \h </w:instrText>
+          <w:instrText xml:space="preserve"> PAGEREF _Toc242346798 \h </w:instrText>
         </w:r>
         <w:r>
           <w:rPr>
@@ -512,7 +512,7 @@
           <w14:ligatures w14:val="standardContextual"/>
         </w:rPr>
       </w:pPr>
-      <w:hyperlink w:anchor="_Toc242290526" w:history="1">
+      <w:hyperlink w:anchor="_Toc242346799" w:history="1">
         <w:r>
           <w:rPr>
             <w:rStyle w:val="Hyperlink"/>
@@ -539,7 +539,7 @@
             <w:noProof/>
             <w:webHidden/>
           </w:rPr>
-          <w:instrText xml:space="preserve"> PAGEREF _Toc242290526 \h </w:instrText>
+          <w:instrText xml:space="preserve"> PAGEREF _Toc242346799 \h </w:instrText>
         </w:r>
         <w:r>
           <w:rPr>
@@ -586,7 +586,7 @@
           <w14:ligatures w14:val="standardContextual"/>
         </w:rPr>
       </w:pPr>
-      <w:hyperlink w:anchor="_Toc242290527" w:history="1">
+      <w:hyperlink w:anchor="_Toc242346800" w:history="1">
         <w:r>
           <w:rPr>
             <w:rStyle w:val="Hyperlink"/>
@@ -613,7 +613,7 @@
             <w:noProof/>
             <w:webHidden/>
           </w:rPr>
-          <w:instrText xml:space="preserve"> PAGEREF _Toc242290527 \h </w:instrText>
+          <w:instrText xml:space="preserve"> PAGEREF _Toc242346800 \h </w:instrText>
         </w:r>
         <w:r>
           <w:rPr>
@@ -660,7 +660,7 @@
           <w14:ligatures w14:val="standardContextual"/>
         </w:rPr>
       </w:pPr>
-      <w:hyperlink w:anchor="_Toc242290528" w:history="1">
+      <w:hyperlink w:anchor="_Toc242346801" w:history="1">
         <w:r>
           <w:rPr>
             <w:rStyle w:val="Hyperlink"/>
@@ -687,7 +687,7 @@
             <w:noProof/>
             <w:webHidden/>
           </w:rPr>
-          <w:instrText xml:space="preserve"> PAGEREF _Toc242290528 \h </w:instrText>
+          <w:instrText xml:space="preserve"> PAGEREF _Toc242346801 \h </w:instrText>
         </w:r>
         <w:r>
           <w:rPr>
@@ -734,7 +734,7 @@
           <w14:ligatures w14:val="standardContextual"/>
         </w:rPr>
       </w:pPr>
-      <w:hyperlink w:anchor="_Toc242290529" w:history="1">
+      <w:hyperlink w:anchor="_Toc242346802" w:history="1">
         <w:r>
           <w:rPr>
             <w:rStyle w:val="Hyperlink"/>
@@ -761,7 +761,7 @@
             <w:noProof/>
             <w:webHidden/>
           </w:rPr>
-          <w:instrText xml:space="preserve"> PAGEREF _Toc242290529 \h </w:instrText>
+          <w:instrText xml:space="preserve"> PAGEREF _Toc242346802 \h </w:instrText>
         </w:r>
         <w:r>
           <w:rPr>
@@ -808,7 +808,7 @@
           <w14:ligatures w14:val="standardContextual"/>
         </w:rPr>
       </w:pPr>
-      <w:hyperlink w:anchor="_Toc242290530" w:history="1">
+      <w:hyperlink w:anchor="_Toc242346803" w:history="1">
         <w:r>
           <w:rPr>
             <w:rStyle w:val="Hyperlink"/>
@@ -835,7 +835,7 @@
             <w:noProof/>
             <w:webHidden/>
           </w:rPr>
-          <w:instrText xml:space="preserve"> PAGEREF _Toc242290530 \h </w:instrText>
+          <w:instrText xml:space="preserve"> PAGEREF _Toc242346803 \h </w:instrText>
         </w:r>
         <w:r>
           <w:rPr>
@@ -882,7 +882,7 @@
           <w14:ligatures w14:val="standardContextual"/>
         </w:rPr>
       </w:pPr>
-      <w:hyperlink w:anchor="_Toc242290531" w:history="1">
+      <w:hyperlink w:anchor="_Toc242346804" w:history="1">
         <w:r>
           <w:rPr>
             <w:rStyle w:val="Hyperlink"/>
@@ -909,7 +909,7 @@
             <w:noProof/>
             <w:webHidden/>
           </w:rPr>
-          <w:instrText xml:space="preserve"> PAGEREF _Toc242290531 \h </w:instrText>
+          <w:instrText xml:space="preserve"> PAGEREF _Toc242346804 \h </w:instrText>
         </w:r>
         <w:r>
           <w:rPr>
@@ -956,7 +956,7 @@
           <w14:ligatures w14:val="standardContextual"/>
         </w:rPr>
       </w:pPr>
-      <w:hyperlink w:anchor="_Toc242290532" w:history="1">
+      <w:hyperlink w:anchor="_Toc242346805" w:history="1">
         <w:r>
           <w:rPr>
             <w:rStyle w:val="Hyperlink"/>
@@ -983,7 +983,7 @@
             <w:noProof/>
             <w:webHidden/>
           </w:rPr>
-          <w:instrText xml:space="preserve"> PAGEREF _Toc242290532 \h </w:instrText>
+          <w:instrText xml:space="preserve"> PAGEREF _Toc242346805 \h </w:instrText>
         </w:r>
         <w:r>
           <w:rPr>
@@ -1030,7 +1030,7 @@
           <w14:ligatures w14:val="standardContextual"/>
         </w:rPr>
       </w:pPr>
-      <w:hyperlink w:anchor="_Toc242290533" w:history="1">
+      <w:hyperlink w:anchor="_Toc242346806" w:history="1">
         <w:r>
           <w:rPr>
             <w:rStyle w:val="Hyperlink"/>
@@ -1057,7 +1057,7 @@
             <w:noProof/>
             <w:webHidden/>
           </w:rPr>
-          <w:instrText xml:space="preserve"> PAGEREF _Toc242290533 \h </w:instrText>
+          <w:instrText xml:space="preserve"> PAGEREF _Toc242346806 \h </w:instrText>
         </w:r>
         <w:r>
           <w:rPr>
@@ -1104,7 +1104,7 @@
           <w14:ligatures w14:val="standardContextual"/>
         </w:rPr>
       </w:pPr>
-      <w:hyperlink w:anchor="_Toc242290534" w:history="1">
+      <w:hyperlink w:anchor="_Toc242346807" w:history="1">
         <w:r>
           <w:rPr>
             <w:rStyle w:val="Hyperlink"/>
@@ -1131,7 +1131,7 @@
             <w:noProof/>
             <w:webHidden/>
           </w:rPr>
-          <w:instrText xml:space="preserve"> PAGEREF _Toc242290534 \h </w:instrText>
+          <w:instrText xml:space="preserve"> PAGEREF _Toc242346807 \h </w:instrText>
         </w:r>
         <w:r>
           <w:rPr>
@@ -1178,7 +1178,7 @@
           <w14:ligatures w14:val="standardContextual"/>
         </w:rPr>
       </w:pPr>
-      <w:hyperlink w:anchor="_Toc242290535" w:history="1">
+      <w:hyperlink w:anchor="_Toc242346808" w:history="1">
         <w:r>
           <w:rPr>
             <w:rStyle w:val="Hyperlink"/>
@@ -1205,7 +1205,7 @@
             <w:noProof/>
             <w:webHidden/>
           </w:rPr>
-          <w:instrText xml:space="preserve"> PAGEREF _Toc242290535 \h </w:instrText>
+          <w:instrText xml:space="preserve"> PAGEREF _Toc242346808 \h </w:instrText>
         </w:r>
         <w:r>
           <w:rPr>
@@ -1252,7 +1252,7 @@
           <w14:ligatures w14:val="standardContextual"/>
         </w:rPr>
       </w:pPr>
-      <w:hyperlink w:anchor="_Toc242290536" w:history="1">
+      <w:hyperlink w:anchor="_Toc242346809" w:history="1">
         <w:r>
           <w:rPr>
             <w:rStyle w:val="Hyperlink"/>
@@ -1279,7 +1279,7 @@
             <w:noProof/>
             <w:webHidden/>
           </w:rPr>
-          <w:instrText xml:space="preserve"> PAGEREF _Toc242290536 \h </w:instrText>
+          <w:instrText xml:space="preserve"> PAGEREF _Toc242346809 \h </w:instrText>
         </w:r>
         <w:r>
           <w:rPr>
@@ -1326,7 +1326,7 @@
           <w14:ligatures w14:val="standardContextual"/>
         </w:rPr>
       </w:pPr>
-      <w:hyperlink w:anchor="_Toc242290537" w:history="1">
+      <w:hyperlink w:anchor="_Toc242346810" w:history="1">
         <w:r>
           <w:rPr>
             <w:rStyle w:val="Hyperlink"/>
@@ -1353,7 +1353,7 @@
             <w:noProof/>
             <w:webHidden/>
           </w:rPr>
-          <w:instrText xml:space="preserve"> PAGEREF _Toc242290537 \h </w:instrText>
+          <w:instrText xml:space="preserve"> PAGEREF _Toc242346810 \h </w:instrText>
         </w:r>
         <w:r>
           <w:rPr>
@@ -1400,7 +1400,7 @@
           <w14:ligatures w14:val="standardContextual"/>
         </w:rPr>
       </w:pPr>
-      <w:hyperlink w:anchor="_Toc242290538" w:history="1">
+      <w:hyperlink w:anchor="_Toc242346811" w:history="1">
         <w:r>
           <w:rPr>
             <w:rStyle w:val="Hyperlink"/>
@@ -1427,7 +1427,7 @@
             <w:noProof/>
             <w:webHidden/>
           </w:rPr>
-          <w:instrText xml:space="preserve"> PAGEREF _Toc242290538 \h </w:instrText>
+          <w:instrText xml:space="preserve"> PAGEREF _Toc242346811 \h </w:instrText>
         </w:r>
         <w:r>
           <w:rPr>
@@ -1474,7 +1474,7 @@
           <w14:ligatures w14:val="standardContextual"/>
         </w:rPr>
       </w:pPr>
-      <w:hyperlink w:anchor="_Toc242290539" w:history="1">
+      <w:hyperlink w:anchor="_Toc242346812" w:history="1">
         <w:r>
           <w:rPr>
             <w:rStyle w:val="Hyperlink"/>
@@ -1501,7 +1501,7 @@
             <w:noProof/>
             <w:webHidden/>
           </w:rPr>
-          <w:instrText xml:space="preserve"> PAGEREF _Toc242290539 \h </w:instrText>
+          <w:instrText xml:space="preserve"> PAGEREF _Toc242346812 \h </w:instrText>
         </w:r>
         <w:r>
           <w:rPr>
@@ -1548,7 +1548,7 @@
           <w14:ligatures w14:val="standardContextual"/>
         </w:rPr>
       </w:pPr>
-      <w:hyperlink w:anchor="_Toc242290540" w:history="1">
+      <w:hyperlink w:anchor="_Toc242346813" w:history="1">
         <w:r>
           <w:rPr>
             <w:rStyle w:val="Hyperlink"/>
@@ -1575,7 +1575,7 @@
             <w:noProof/>
             <w:webHidden/>
           </w:rPr>
-          <w:instrText xml:space="preserve"> PAGEREF _Toc242290540 \h </w:instrText>
+          <w:instrText xml:space="preserve"> PAGEREF _Toc242346813 \h </w:instrText>
         </w:r>
         <w:r>
           <w:rPr>
@@ -1622,7 +1622,7 @@
           <w14:ligatures w14:val="standardContextual"/>
         </w:rPr>
       </w:pPr>
-      <w:hyperlink w:anchor="_Toc242290541" w:history="1">
+      <w:hyperlink w:anchor="_Toc242346814" w:history="1">
         <w:r>
           <w:rPr>
             <w:rStyle w:val="Hyperlink"/>
@@ -1649,7 +1649,7 @@
             <w:noProof/>
             <w:webHidden/>
           </w:rPr>
-          <w:instrText xml:space="preserve"> PAGEREF _Toc242290541 \h </w:instrText>
+          <w:instrText xml:space="preserve"> PAGEREF _Toc242346814 \h </w:instrText>
         </w:r>
         <w:r>
           <w:rPr>
@@ -1696,7 +1696,7 @@
           <w14:ligatures w14:val="standardContextual"/>
         </w:rPr>
       </w:pPr>
-      <w:hyperlink w:anchor="_Toc242290542" w:history="1">
+      <w:hyperlink w:anchor="_Toc242346815" w:history="1">
         <w:r>
           <w:rPr>
             <w:rStyle w:val="Hyperlink"/>
@@ -1723,7 +1723,7 @@
             <w:noProof/>
             <w:webHidden/>
           </w:rPr>
-          <w:instrText xml:space="preserve"> PAGEREF _Toc242290542 \h </w:instrText>
+          <w:instrText xml:space="preserve"> PAGEREF _Toc242346815 \h </w:instrText>
         </w:r>
         <w:r>
           <w:rPr>
@@ -1743,7 +1743,7 @@
             <w:noProof/>
             <w:webHidden/>
           </w:rPr>
-          <w:t>6</w:t>
+          <w:t>7</w:t>
         </w:r>
         <w:r>
           <w:rPr>
@@ -1770,7 +1770,7 @@
           <w14:ligatures w14:val="standardContextual"/>
         </w:rPr>
       </w:pPr>
-      <w:hyperlink w:anchor="_Toc242290543" w:history="1">
+      <w:hyperlink w:anchor="_Toc242346816" w:history="1">
         <w:r>
           <w:rPr>
             <w:rStyle w:val="Hyperlink"/>
@@ -1797,7 +1797,7 @@
             <w:noProof/>
             <w:webHidden/>
           </w:rPr>
-          <w:instrText xml:space="preserve"> PAGEREF _Toc242290543 \h </w:instrText>
+          <w:instrText xml:space="preserve"> PAGEREF _Toc242346816 \h </w:instrText>
         </w:r>
         <w:r>
           <w:rPr>
@@ -1844,7 +1844,7 @@
           <w14:ligatures w14:val="standardContextual"/>
         </w:rPr>
       </w:pPr>
-      <w:hyperlink w:anchor="_Toc242290544" w:history="1">
+      <w:hyperlink w:anchor="_Toc242346817" w:history="1">
         <w:r>
           <w:rPr>
             <w:rStyle w:val="Hyperlink"/>
@@ -1871,7 +1871,7 @@
             <w:noProof/>
             <w:webHidden/>
           </w:rPr>
-          <w:instrText xml:space="preserve"> PAGEREF _Toc242290544 \h </w:instrText>
+          <w:instrText xml:space="preserve"> PAGEREF _Toc242346817 \h </w:instrText>
         </w:r>
         <w:r>
           <w:rPr>
@@ -1918,7 +1918,7 @@
           <w14:ligatures w14:val="standardContextual"/>
         </w:rPr>
       </w:pPr>
-      <w:hyperlink w:anchor="_Toc242290545" w:history="1">
+      <w:hyperlink w:anchor="_Toc242346818" w:history="1">
         <w:r>
           <w:rPr>
             <w:rStyle w:val="Hyperlink"/>
@@ -1945,7 +1945,7 @@
             <w:noProof/>
             <w:webHidden/>
           </w:rPr>
-          <w:instrText xml:space="preserve"> PAGEREF _Toc242290545 \h </w:instrText>
+          <w:instrText xml:space="preserve"> PAGEREF _Toc242346818 \h </w:instrText>
         </w:r>
         <w:r>
           <w:rPr>
@@ -1992,7 +1992,7 @@
           <w14:ligatures w14:val="standardContextual"/>
         </w:rPr>
       </w:pPr>
-      <w:hyperlink w:anchor="_Toc242290546" w:history="1">
+      <w:hyperlink w:anchor="_Toc242346819" w:history="1">
         <w:r>
           <w:rPr>
             <w:rStyle w:val="Hyperlink"/>
@@ -2019,7 +2019,7 @@
             <w:noProof/>
             <w:webHidden/>
           </w:rPr>
-          <w:instrText xml:space="preserve"> PAGEREF _Toc242290546 \h </w:instrText>
+          <w:instrText xml:space="preserve"> PAGEREF _Toc242346819 \h </w:instrText>
         </w:r>
         <w:r>
           <w:rPr>
@@ -2066,7 +2066,7 @@
           <w14:ligatures w14:val="standardContextual"/>
         </w:rPr>
       </w:pPr>
-      <w:hyperlink w:anchor="_Toc242290547" w:history="1">
+      <w:hyperlink w:anchor="_Toc242346820" w:history="1">
         <w:r>
           <w:rPr>
             <w:rStyle w:val="Hyperlink"/>
@@ -2093,7 +2093,7 @@
             <w:noProof/>
             <w:webHidden/>
           </w:rPr>
-          <w:instrText xml:space="preserve"> PAGEREF _Toc242290547 \h </w:instrText>
+          <w:instrText xml:space="preserve"> PAGEREF _Toc242346820 \h </w:instrText>
         </w:r>
         <w:r>
           <w:rPr>
@@ -2113,7 +2113,7 @@
             <w:noProof/>
             <w:webHidden/>
           </w:rPr>
-          <w:t>7</w:t>
+          <w:t>8</w:t>
         </w:r>
         <w:r>
           <w:rPr>
@@ -2140,7 +2140,7 @@
           <w14:ligatures w14:val="standardContextual"/>
         </w:rPr>
       </w:pPr>
-      <w:hyperlink w:anchor="_Toc242290548" w:history="1">
+      <w:hyperlink w:anchor="_Toc242346821" w:history="1">
         <w:r>
           <w:rPr>
             <w:rStyle w:val="Hyperlink"/>
@@ -2167,7 +2167,7 @@
             <w:noProof/>
             <w:webHidden/>
           </w:rPr>
-          <w:instrText xml:space="preserve"> PAGEREF _Toc242290548 \h </w:instrText>
+          <w:instrText xml:space="preserve"> PAGEREF _Toc242346821 \h </w:instrText>
         </w:r>
         <w:r>
           <w:rPr>
@@ -2214,7 +2214,7 @@
           <w14:ligatures w14:val="standardContextual"/>
         </w:rPr>
       </w:pPr>
-      <w:hyperlink w:anchor="_Toc242290549" w:history="1">
+      <w:hyperlink w:anchor="_Toc242346822" w:history="1">
         <w:r>
           <w:rPr>
             <w:rStyle w:val="Hyperlink"/>
@@ -2241,7 +2241,7 @@
             <w:noProof/>
             <w:webHidden/>
           </w:rPr>
-          <w:instrText xml:space="preserve"> PAGEREF _Toc242290549 \h </w:instrText>
+          <w:instrText xml:space="preserve"> PAGEREF _Toc242346822 \h </w:instrText>
         </w:r>
         <w:r>
           <w:rPr>
@@ -2288,7 +2288,7 @@
           <w14:ligatures w14:val="standardContextual"/>
         </w:rPr>
       </w:pPr>
-      <w:hyperlink w:anchor="_Toc242290550" w:history="1">
+      <w:hyperlink w:anchor="_Toc242346823" w:history="1">
         <w:r>
           <w:rPr>
             <w:rStyle w:val="Hyperlink"/>
@@ -2315,7 +2315,7 @@
             <w:noProof/>
             <w:webHidden/>
           </w:rPr>
-          <w:instrText xml:space="preserve"> PAGEREF _Toc242290550 \h </w:instrText>
+          <w:instrText xml:space="preserve"> PAGEREF _Toc242346823 \h </w:instrText>
         </w:r>
         <w:r>
           <w:rPr>
@@ -2362,7 +2362,7 @@
           <w14:ligatures w14:val="standardContextual"/>
         </w:rPr>
       </w:pPr>
-      <w:hyperlink w:anchor="_Toc242290551" w:history="1">
+      <w:hyperlink w:anchor="_Toc242346824" w:history="1">
         <w:r>
           <w:rPr>
             <w:rStyle w:val="Hyperlink"/>
@@ -2389,7 +2389,7 @@
             <w:noProof/>
             <w:webHidden/>
           </w:rPr>
-          <w:instrText xml:space="preserve"> PAGEREF _Toc242290551 \h </w:instrText>
+          <w:instrText xml:space="preserve"> PAGEREF _Toc242346824 \h </w:instrText>
         </w:r>
         <w:r>
           <w:rPr>
@@ -2436,7 +2436,7 @@
           <w14:ligatures w14:val="standardContextual"/>
         </w:rPr>
       </w:pPr>
-      <w:hyperlink w:anchor="_Toc242290552" w:history="1">
+      <w:hyperlink w:anchor="_Toc242346825" w:history="1">
         <w:r>
           <w:rPr>
             <w:rStyle w:val="Hyperlink"/>
@@ -2463,7 +2463,7 @@
             <w:noProof/>
             <w:webHidden/>
           </w:rPr>
-          <w:instrText xml:space="preserve"> PAGEREF _Toc242290552 \h </w:instrText>
+          <w:instrText xml:space="preserve"> PAGEREF _Toc242346825 \h </w:instrText>
         </w:r>
         <w:r>
           <w:rPr>
@@ -2510,7 +2510,7 @@
           <w14:ligatures w14:val="standardContextual"/>
         </w:rPr>
       </w:pPr>
-      <w:hyperlink w:anchor="_Toc242290553" w:history="1">
+      <w:hyperlink w:anchor="_Toc242346826" w:history="1">
         <w:r>
           <w:rPr>
             <w:rStyle w:val="Hyperlink"/>
@@ -2537,7 +2537,7 @@
             <w:noProof/>
             <w:webHidden/>
           </w:rPr>
-          <w:instrText xml:space="preserve"> PAGEREF _Toc242290553 \h </w:instrText>
+          <w:instrText xml:space="preserve"> PAGEREF _Toc242346826 \h </w:instrText>
         </w:r>
         <w:r>
           <w:rPr>
@@ -2584,7 +2584,7 @@
           <w14:ligatures w14:val="standardContextual"/>
         </w:rPr>
       </w:pPr>
-      <w:hyperlink w:anchor="_Toc242290554" w:history="1">
+      <w:hyperlink w:anchor="_Toc242346827" w:history="1">
         <w:r>
           <w:rPr>
             <w:rStyle w:val="Hyperlink"/>
@@ -2611,7 +2611,7 @@
             <w:noProof/>
             <w:webHidden/>
           </w:rPr>
-          <w:instrText xml:space="preserve"> PAGEREF _Toc242290554 \h </w:instrText>
+          <w:instrText xml:space="preserve"> PAGEREF _Toc242346827 \h </w:instrText>
         </w:r>
         <w:r>
           <w:rPr>
@@ -2658,7 +2658,7 @@
           <w14:ligatures w14:val="standardContextual"/>
         </w:rPr>
       </w:pPr>
-      <w:hyperlink w:anchor="_Toc242290555" w:history="1">
+      <w:hyperlink w:anchor="_Toc242346828" w:history="1">
         <w:r>
           <w:rPr>
             <w:rStyle w:val="Hyperlink"/>
@@ -2685,7 +2685,7 @@
             <w:noProof/>
             <w:webHidden/>
           </w:rPr>
-          <w:instrText xml:space="preserve"> PAGEREF _Toc242290555 \h </w:instrText>
+          <w:instrText xml:space="preserve"> PAGEREF _Toc242346828 \h </w:instrText>
         </w:r>
         <w:r>
           <w:rPr>
@@ -2732,7 +2732,7 @@
           <w14:ligatures w14:val="standardContextual"/>
         </w:rPr>
       </w:pPr>
-      <w:hyperlink w:anchor="_Toc242290556" w:history="1">
+      <w:hyperlink w:anchor="_Toc242346829" w:history="1">
         <w:r>
           <w:rPr>
             <w:rStyle w:val="Hyperlink"/>
@@ -2759,7 +2759,7 @@
             <w:noProof/>
             <w:webHidden/>
           </w:rPr>
-          <w:instrText xml:space="preserve"> PAGEREF _Toc242290556 \h </w:instrText>
+          <w:instrText xml:space="preserve"> PAGEREF _Toc242346829 \h </w:instrText>
         </w:r>
         <w:r>
           <w:rPr>
@@ -2779,7 +2779,7 @@
             <w:noProof/>
             <w:webHidden/>
           </w:rPr>
-          <w:t>9</w:t>
+          <w:t>10</w:t>
         </w:r>
         <w:r>
           <w:rPr>
@@ -2806,7 +2806,7 @@
           <w14:ligatures w14:val="standardContextual"/>
         </w:rPr>
       </w:pPr>
-      <w:hyperlink w:anchor="_Toc242290557" w:history="1">
+      <w:hyperlink w:anchor="_Toc242346830" w:history="1">
         <w:r>
           <w:rPr>
             <w:rStyle w:val="Hyperlink"/>
@@ -2833,7 +2833,7 @@
             <w:noProof/>
             <w:webHidden/>
           </w:rPr>
-          <w:instrText xml:space="preserve"> PAGEREF _Toc242290557 \h </w:instrText>
+          <w:instrText xml:space="preserve"> PAGEREF _Toc242346830 \h </w:instrText>
         </w:r>
         <w:r>
           <w:rPr>
@@ -2853,7 +2853,7 @@
             <w:noProof/>
             <w:webHidden/>
           </w:rPr>
-          <w:t>9</w:t>
+          <w:t>10</w:t>
         </w:r>
         <w:r>
           <w:rPr>
@@ -2880,7 +2880,7 @@
           <w14:ligatures w14:val="standardContextual"/>
         </w:rPr>
       </w:pPr>
-      <w:hyperlink w:anchor="_Toc242290558" w:history="1">
+      <w:hyperlink w:anchor="_Toc242346831" w:history="1">
         <w:r>
           <w:rPr>
             <w:rStyle w:val="Hyperlink"/>
@@ -2907,7 +2907,7 @@
             <w:noProof/>
             <w:webHidden/>
           </w:rPr>
-          <w:instrText xml:space="preserve"> PAGEREF _Toc242290558 \h </w:instrText>
+          <w:instrText xml:space="preserve"> PAGEREF _Toc242346831 \h </w:instrText>
         </w:r>
         <w:r>
           <w:rPr>
@@ -2927,7 +2927,7 @@
             <w:noProof/>
             <w:webHidden/>
           </w:rPr>
-          <w:t>9</w:t>
+          <w:t>10</w:t>
         </w:r>
         <w:r>
           <w:rPr>
@@ -2954,7 +2954,7 @@
           <w14:ligatures w14:val="standardContextual"/>
         </w:rPr>
       </w:pPr>
-      <w:hyperlink w:anchor="_Toc242290559" w:history="1">
+      <w:hyperlink w:anchor="_Toc242346832" w:history="1">
         <w:r>
           <w:rPr>
             <w:rStyle w:val="Hyperlink"/>
@@ -2981,7 +2981,7 @@
             <w:noProof/>
             <w:webHidden/>
           </w:rPr>
-          <w:instrText xml:space="preserve"> PAGEREF _Toc242290559 \h </w:instrText>
+          <w:instrText xml:space="preserve"> PAGEREF _Toc242346832 \h </w:instrText>
         </w:r>
         <w:r>
           <w:rPr>
@@ -3028,7 +3028,7 @@
           <w14:ligatures w14:val="standardContextual"/>
         </w:rPr>
       </w:pPr>
-      <w:hyperlink w:anchor="_Toc242290560" w:history="1">
+      <w:hyperlink w:anchor="_Toc242346833" w:history="1">
         <w:r>
           <w:rPr>
             <w:rStyle w:val="Hyperlink"/>
@@ -3055,7 +3055,7 @@
             <w:noProof/>
             <w:webHidden/>
           </w:rPr>
-          <w:instrText xml:space="preserve"> PAGEREF _Toc242290560 \h </w:instrText>
+          <w:instrText xml:space="preserve"> PAGEREF _Toc242346833 \h </w:instrText>
         </w:r>
         <w:r>
           <w:rPr>
@@ -3102,7 +3102,7 @@
           <w14:ligatures w14:val="standardContextual"/>
         </w:rPr>
       </w:pPr>
-      <w:hyperlink w:anchor="_Toc242290561" w:history="1">
+      <w:hyperlink w:anchor="_Toc242346834" w:history="1">
         <w:r>
           <w:rPr>
             <w:rStyle w:val="Hyperlink"/>
@@ -3129,7 +3129,7 @@
             <w:noProof/>
             <w:webHidden/>
           </w:rPr>
-          <w:instrText xml:space="preserve"> PAGEREF _Toc242290561 \h </w:instrText>
+          <w:instrText xml:space="preserve"> PAGEREF _Toc242346834 \h </w:instrText>
         </w:r>
         <w:r>
           <w:rPr>
@@ -3176,7 +3176,7 @@
           <w14:ligatures w14:val="standardContextual"/>
         </w:rPr>
       </w:pPr>
-      <w:hyperlink w:anchor="_Toc242290562" w:history="1">
+      <w:hyperlink w:anchor="_Toc242346835" w:history="1">
         <w:r>
           <w:rPr>
             <w:rStyle w:val="Hyperlink"/>
@@ -3203,7 +3203,7 @@
             <w:noProof/>
             <w:webHidden/>
           </w:rPr>
-          <w:instrText xml:space="preserve"> PAGEREF _Toc242290562 \h </w:instrText>
+          <w:instrText xml:space="preserve"> PAGEREF _Toc242346835 \h </w:instrText>
         </w:r>
         <w:r>
           <w:rPr>
@@ -3223,7 +3223,7 @@
             <w:noProof/>
             <w:webHidden/>
           </w:rPr>
-          <w:t>10</w:t>
+          <w:t>11</w:t>
         </w:r>
         <w:r>
           <w:rPr>
@@ -3248,7 +3248,7 @@
       <w:pPr>
         <w:pStyle w:val="Heading1"/>
       </w:pPr>
-      <w:bookmarkStart w:id="0" w:name="_Toc242290522"/>
+      <w:bookmarkStart w:id="0" w:name="_Toc242346795"/>
       <w:r>
         <w:lastRenderedPageBreak/>
         <w:t>1. Información general del producto</w:t>
@@ -3624,7 +3624,7 @@
               <w:rPr>
                 <w:sz w:val="19"/>
               </w:rPr>
-              <w:t>Funcional. Validado con 10 semillas en diez experimentos y una ablación, con 36 pruebas automáticas y autoprueba del ejecutable.</w:t>
+              <w:t>Funcional. Validado con 10 semillas en diez experimentos y una ablación, con 51 pruebas automáticas y autoprueba del ejecutable.</w:t>
             </w:r>
           </w:p>
         </w:tc>
@@ -3843,7 +3843,7 @@
       <w:pPr>
         <w:pStyle w:val="Heading1"/>
       </w:pPr>
-      <w:bookmarkStart w:id="1" w:name="_Toc242290523"/>
+      <w:bookmarkStart w:id="1" w:name="_Toc242346796"/>
       <w:r>
         <w:t>2. Descripción general del software</w:t>
       </w:r>
@@ -3861,7 +3861,7 @@
       <w:pPr>
         <w:pStyle w:val="Heading2"/>
       </w:pPr>
-      <w:bookmarkStart w:id="2" w:name="_Toc242290524"/>
+      <w:bookmarkStart w:id="2" w:name="_Toc242346797"/>
       <w:r>
         <w:t>2.1 Especificación de requisitos de hardware y software</w:t>
       </w:r>
@@ -3871,7 +3871,7 @@
       <w:pPr>
         <w:pStyle w:val="Heading3"/>
       </w:pPr>
-      <w:bookmarkStart w:id="3" w:name="_Toc242290525"/>
+      <w:bookmarkStart w:id="3" w:name="_Toc242346798"/>
       <w:r>
         <w:t>Requisitos para el usuario final</w:t>
       </w:r>
@@ -3879,14 +3879,14 @@
     </w:p>
     <w:p>
       <w:r>
-        <w:t>Windows 10 u 11 de 64 bits. La carpeta de la aplicación ocupa 375 MB (155 MB comprimida) y el modelo de voz descargado 141 MB. Memoria máxima medida durante la autoprueba completa: 895 MB, en un equipo con Intel(R) Core(TM) i5-10300H CPU @ 2.50GHz y 40 GB de RAM.</w:t>
+        <w:t>Windows 10 u 11 de 64 bits. La carpeta de la aplicación ocupa 379 MB (157 MB comprimida) y el modelo de voz descargado 141 MB. Memoria máxima medida durante la autoprueba completa: 1116 MB, en un equipo con Intel(R) Core(TM) i5-10300H CPU @ 2.50GHz y 40 GB de RAM.</w:t>
       </w:r>
     </w:p>
     <w:p>
       <w:pPr>
         <w:pStyle w:val="Heading3"/>
       </w:pPr>
-      <w:bookmarkStart w:id="4" w:name="_Toc242290526"/>
+      <w:bookmarkStart w:id="4" w:name="_Toc242346799"/>
       <w:r>
         <w:lastRenderedPageBreak/>
         <w:t>Entorno de software en modo desarrollo</w:t>
@@ -3902,7 +3902,7 @@
       <w:pPr>
         <w:pStyle w:val="Heading3"/>
       </w:pPr>
-      <w:bookmarkStart w:id="5" w:name="_Toc242290527"/>
+      <w:bookmarkStart w:id="5" w:name="_Toc242346800"/>
       <w:r>
         <w:t>Requisito de operación sin red</w:t>
       </w:r>
@@ -3910,14 +3910,14 @@
     </w:p>
     <w:p>
       <w:r>
-        <w:t>Todo el núcleo científico, los ejemplos de texto y todos los experimentos de texto funcionan sin red. Solo la primera descarga del modelo de reconocimiento de voz requiere conexión.</w:t>
+        <w:t>Todo el núcleo científico, nueve de los diez ejemplos y todos los experimentos de texto funcionan sin red y sin micrófono. Las funciones de voz necesitan el modelo de reconocimiento, cuya primera descarga requiere conexión, y el ejemplo 02 y el experimento de audio usan además el motor de síntesis de voz de Windows (SAPI).</w:t>
       </w:r>
     </w:p>
     <w:p>
       <w:pPr>
         <w:pStyle w:val="Heading2"/>
       </w:pPr>
-      <w:bookmarkStart w:id="6" w:name="_Toc242290528"/>
+      <w:bookmarkStart w:id="6" w:name="_Toc242346801"/>
       <w:r>
         <w:t>2.2 Justificación de los requisitos</w:t>
       </w:r>
@@ -3932,7 +3932,7 @@
       <w:pPr>
         <w:pStyle w:val="Heading1"/>
       </w:pPr>
-      <w:bookmarkStart w:id="7" w:name="_Toc242290529"/>
+      <w:bookmarkStart w:id="7" w:name="_Toc242346802"/>
       <w:r>
         <w:t>3. Objetivos y área de aplicación</w:t>
       </w:r>
@@ -3942,7 +3942,7 @@
       <w:pPr>
         <w:pStyle w:val="Heading2"/>
       </w:pPr>
-      <w:bookmarkStart w:id="8" w:name="_Toc242290530"/>
+      <w:bookmarkStart w:id="8" w:name="_Toc242346803"/>
       <w:r>
         <w:t>3.1 Objetivo general</w:t>
       </w:r>
@@ -3957,7 +3957,7 @@
       <w:pPr>
         <w:pStyle w:val="Heading2"/>
       </w:pPr>
-      <w:bookmarkStart w:id="9" w:name="_Toc242290531"/>
+      <w:bookmarkStart w:id="9" w:name="_Toc242346804"/>
       <w:r>
         <w:t>3.2 Área de aplicación</w:t>
       </w:r>
@@ -3972,7 +3972,7 @@
       <w:pPr>
         <w:pStyle w:val="Heading1"/>
       </w:pPr>
-      <w:bookmarkStart w:id="10" w:name="_Toc242290532"/>
+      <w:bookmarkStart w:id="10" w:name="_Toc242346805"/>
       <w:r>
         <w:t>4. Funcionalidades principales</w:t>
       </w:r>
@@ -4046,7 +4046,7 @@
       <w:pPr>
         <w:pStyle w:val="Heading1"/>
       </w:pPr>
-      <w:bookmarkStart w:id="11" w:name="_Toc242290533"/>
+      <w:bookmarkStart w:id="11" w:name="_Toc242346806"/>
       <w:r>
         <w:lastRenderedPageBreak/>
         <w:t>5. Adaptabilidad, extensibilidad y mantenibilidad</w:t>
@@ -4057,7 +4057,7 @@
       <w:pPr>
         <w:pStyle w:val="Heading3"/>
       </w:pPr>
-      <w:bookmarkStart w:id="12" w:name="_Toc242290534"/>
+      <w:bookmarkStart w:id="12" w:name="_Toc242346807"/>
       <w:r>
         <w:t>Modularidad</w:t>
       </w:r>
@@ -4072,7 +4072,7 @@
       <w:pPr>
         <w:pStyle w:val="Heading3"/>
       </w:pPr>
-      <w:bookmarkStart w:id="13" w:name="_Toc242290535"/>
+      <w:bookmarkStart w:id="13" w:name="_Toc242346808"/>
       <w:r>
         <w:t>Incorporación de nuevas intenciones y modelos</w:t>
       </w:r>
@@ -4087,7 +4087,7 @@
       <w:pPr>
         <w:pStyle w:val="Heading3"/>
       </w:pPr>
-      <w:bookmarkStart w:id="14" w:name="_Toc242290536"/>
+      <w:bookmarkStart w:id="14" w:name="_Toc242346809"/>
       <w:r>
         <w:t>Configuración y parametrización</w:t>
       </w:r>
@@ -4095,14 +4095,14 @@
     </w:p>
     <w:p>
       <w:r>
-        <w:t>Costos, semillas, tamaños de datos y componentes de UCIL se definen en archivos YAML o en la pestaña Configuración.</w:t>
+        <w:t>Costos, semillas, tamaños de datos y componentes de UCIL de cada experimento se definen en su archivo YAML. La pestaña Configuración ajusta el modelo interactivo de las pestañas Probar orden y Voz.</w:t>
       </w:r>
     </w:p>
     <w:p>
       <w:pPr>
         <w:pStyle w:val="Heading3"/>
       </w:pPr>
-      <w:bookmarkStart w:id="15" w:name="_Toc242290537"/>
+      <w:bookmarkStart w:id="15" w:name="_Toc242346810"/>
       <w:r>
         <w:t>Facilidad de mantenimiento</w:t>
       </w:r>
@@ -4110,14 +4110,14 @@
     </w:p>
     <w:p>
       <w:r>
-        <w:t>36 pruebas automáticas, una autoprueba del ejecutable y resultados deterministas facilitan detectar regresiones.</w:t>
+        <w:t>51 pruebas automáticas, una autoprueba del ejecutable y resultados deterministas facilitan detectar regresiones.</w:t>
       </w:r>
     </w:p>
     <w:p>
       <w:pPr>
         <w:pStyle w:val="Heading1"/>
       </w:pPr>
-      <w:bookmarkStart w:id="16" w:name="_Toc242290538"/>
+      <w:bookmarkStart w:id="16" w:name="_Toc242346811"/>
       <w:r>
         <w:t>6. Robustez, desempeño y consistencia</w:t>
       </w:r>
@@ -4127,7 +4127,7 @@
       <w:pPr>
         <w:pStyle w:val="Heading2"/>
       </w:pPr>
-      <w:bookmarkStart w:id="17" w:name="_Toc242290539"/>
+      <w:bookmarkStart w:id="17" w:name="_Toc242346812"/>
       <w:r>
         <w:t>6.1 Robustez</w:t>
       </w:r>
@@ -4135,14 +4135,14 @@
     </w:p>
     <w:p>
       <w:r>
-        <w:t>Los errores inesperados se muestran en diálogos y no cierran el programa. Si el modelo de voz no está disponible, se informa con un mensaje claro y el resto sigue funcionando. El reconocedor vuelve a CPU si faltan bibliotecas de GPU. Las acciones sensibles pasan por validación de slots y, en modo de ejecución real, las de riesgo alto requieren siempre confirmación.</w:t>
+        <w:t>Los errores inesperados se muestran en diálogos y no cierran el programa. Si el modelo de voz no está disponible, se informa con un mensaje claro y el resto sigue funcionando. El reconocedor vuelve a CPU si faltan bibliotecas de GPU. Ninguna acción con varias opciones se ejecuta sin que el usuario elija una, ninguna con slots ambiguos, faltantes o no válidos se ejecuta, y las de riesgo alto requieren confirmación por defecto. Las correcciones del usuario se guardan con escritura atómica.</w:t>
       </w:r>
     </w:p>
     <w:p>
       <w:pPr>
         <w:pStyle w:val="Heading2"/>
       </w:pPr>
-      <w:bookmarkStart w:id="18" w:name="_Toc242290540"/>
+      <w:bookmarkStart w:id="18" w:name="_Toc242346813"/>
       <w:r>
         <w:t>6.2 Desempeño</w:t>
       </w:r>
@@ -4150,14 +4150,14 @@
     </w:p>
     <w:p>
       <w:r>
-        <w:t>Duración medida por semilla: experimento principal 10.2–16.9 s, personalización 48.2–55.4 s, audio 211.4–228.9 s. La autoprueba completa del ejecutable tardó 96 s.</w:t>
+        <w:t>Duración medida por semilla: experimento principal 10.3–11.5 s, personalización 49.1–63.6 s, audio 210.1–212.3 s. La autoprueba completa del ejecutable tardó 90 s.</w:t>
       </w:r>
     </w:p>
     <w:p>
       <w:pPr>
         <w:pStyle w:val="Heading2"/>
       </w:pPr>
-      <w:bookmarkStart w:id="19" w:name="_Toc242290541"/>
+      <w:bookmarkStart w:id="19" w:name="_Toc242346814"/>
       <w:r>
         <w:t>6.3 Consistencia y reproducibilidad</w:t>
       </w:r>
@@ -4165,15 +4165,16 @@
     </w:p>
     <w:p>
       <w:r>
-        <w:t>Con la misma configuración y semilla, las tablas resultantes son idénticas. El ejecutable produce los mismos resultados que el código fuente. Cada corrida guarda su configuración, versiones y semillas.</w:t>
+        <w:t>En el equipo de prueba, con la misma configuración y semilla, las tablas de los experimentos de texto son idénticas, y el ejecutable produjo los mismos resultados que el código fuente en las corridas reducidas de la autoprueba. Cada corrida guarda su configuración, versiones y semillas. El experimento de audio registra además la voz de síntesis, el modelo de reconocimiento y sus huellas SHA-256, porque sus cifras dependen de ese entorno.</w:t>
       </w:r>
     </w:p>
     <w:p>
       <w:pPr>
         <w:pStyle w:val="Heading1"/>
       </w:pPr>
-      <w:bookmarkStart w:id="20" w:name="_Toc242290542"/>
+      <w:bookmarkStart w:id="20" w:name="_Toc242346815"/>
       <w:r>
+        <w:lastRenderedPageBreak/>
         <w:t>7. Interfaz y usabilidad</w:t>
       </w:r>
       <w:bookmarkEnd w:id="20"/>
@@ -4192,9 +4193,8 @@
         <w:rPr>
           <w:noProof/>
         </w:rPr>
-        <w:lastRenderedPageBreak/>
         <w:drawing>
-          <wp:inline distT="0" distB="0" distL="0" distR="0" wp14:anchorId="5842C175" wp14:editId="14048F02">
+          <wp:inline distT="0" distB="0" distL="0" distR="0" wp14:anchorId="5CFB4737" wp14:editId="2EE7E25F">
             <wp:extent cx="5580000" cy="3833299"/>
             <wp:effectExtent l="0" t="0" r="0" b="0"/>
             <wp:docPr id="1" name="Picture 1"/>
@@ -4250,7 +4250,7 @@
       <w:pPr>
         <w:pStyle w:val="Heading1"/>
       </w:pPr>
-      <w:bookmarkStart w:id="21" w:name="_Toc242290543"/>
+      <w:bookmarkStart w:id="21" w:name="_Toc242346816"/>
       <w:r>
         <w:t>8. Integridad y seguridad de la información</w:t>
       </w:r>
@@ -4258,14 +4258,14 @@
     </w:p>
     <w:p>
       <w:r>
-        <w:t>El procesamiento es local. El audio del micrófono no se guarda. Las acciones se aplican solo a un escritorio simulado y a una lista blanca de intenciones con slots validados. Ninguna orden se convierte en comandos del sistema. Los resultados se guardan con su configuración y metadatos para su trazabilidad.</w:t>
+        <w:t>El procesamiento es local. El audio del micrófono no se guarda. Las acciones se aplican solo a un escritorio simulado y a una lista blanca de intenciones con slots validados. Ninguna orden se convierte en comandos del sistema. Los resultados se guardan con su configuración y metadatos para su trazabilidad. Los modelos se guardan en formato pickle, por lo que la interfaz advierte que solo deben cargarse modelos propios.</w:t>
       </w:r>
     </w:p>
     <w:p>
       <w:pPr>
         <w:pStyle w:val="Heading1"/>
       </w:pPr>
-      <w:bookmarkStart w:id="22" w:name="_Toc242290544"/>
+      <w:bookmarkStart w:id="22" w:name="_Toc242346817"/>
       <w:r>
         <w:t>9. Portabilidad y compatibilidad</w:t>
       </w:r>
@@ -4275,7 +4275,7 @@
       <w:pPr>
         <w:pStyle w:val="Heading2"/>
       </w:pPr>
-      <w:bookmarkStart w:id="23" w:name="_Toc242290545"/>
+      <w:bookmarkStart w:id="23" w:name="_Toc242346818"/>
       <w:r>
         <w:t>9.1 Plataformas compatibles</w:t>
       </w:r>
@@ -4290,7 +4290,7 @@
       <w:pPr>
         <w:pStyle w:val="Heading2"/>
       </w:pPr>
-      <w:bookmarkStart w:id="24" w:name="_Toc242290546"/>
+      <w:bookmarkStart w:id="24" w:name="_Toc242346819"/>
       <w:r>
         <w:t>9.2 Dependencias relevantes</w:t>
       </w:r>
@@ -4298,15 +4298,16 @@
     </w:p>
     <w:p>
       <w:r>
-        <w:t>NumPy 2.5.2, SciPy 1.18.1, scikit-learn 1.9.1, Matplotlib 3.11.2, PyYAML, faster-whisper y tkinter.</w:t>
+        <w:t>NumPy 2.5.2, SciPy 1.18.1, scikit-learn 1.9.1, Matplotlib 3.11.2, PyYAML, faster-whisper, soundfile y tkinter.</w:t>
       </w:r>
     </w:p>
     <w:p>
       <w:pPr>
         <w:pStyle w:val="Heading2"/>
       </w:pPr>
-      <w:bookmarkStart w:id="25" w:name="_Toc242290547"/>
+      <w:bookmarkStart w:id="25" w:name="_Toc242346820"/>
       <w:r>
+        <w:lastRenderedPageBreak/>
         <w:t>9.3 Portabilidad</w:t>
       </w:r>
       <w:bookmarkEnd w:id="25"/>
@@ -4320,9 +4321,8 @@
       <w:pPr>
         <w:pStyle w:val="Heading1"/>
       </w:pPr>
-      <w:bookmarkStart w:id="26" w:name="_Toc242290548"/>
+      <w:bookmarkStart w:id="26" w:name="_Toc242346821"/>
       <w:r>
-        <w:lastRenderedPageBreak/>
         <w:t>10. Documentación y soporte técnico</w:t>
       </w:r>
       <w:bookmarkEnd w:id="26"/>
@@ -4336,7 +4336,7 @@
       <w:pPr>
         <w:pStyle w:val="Heading3"/>
       </w:pPr>
-      <w:bookmarkStart w:id="27" w:name="_Toc242290549"/>
+      <w:bookmarkStart w:id="27" w:name="_Toc242346822"/>
       <w:r>
         <w:t>Soporte técnico</w:t>
       </w:r>
@@ -4351,7 +4351,7 @@
       <w:pPr>
         <w:pStyle w:val="Heading1"/>
       </w:pPr>
-      <w:bookmarkStart w:id="28" w:name="_Toc242290550"/>
+      <w:bookmarkStart w:id="28" w:name="_Toc242346823"/>
       <w:r>
         <w:t>11. Pruebas, validación y desempeño</w:t>
       </w:r>
@@ -4359,7 +4359,7 @@
     </w:p>
     <w:p>
       <w:r>
-        <w:t>Pruebas automáticas: 36. Validación experimental con semillas 100–109 (10 semillas):</w:t>
+        <w:t>Pruebas automáticas: 51. Validación experimental con semillas 100–109 (10 semillas):</w:t>
       </w:r>
     </w:p>
     <w:p>
@@ -4889,8 +4889,9 @@
         <w:rPr>
           <w:noProof/>
         </w:rPr>
+        <w:lastRenderedPageBreak/>
         <w:drawing>
-          <wp:inline distT="0" distB="0" distL="0" distR="0" wp14:anchorId="0DEEE99D" wp14:editId="2184F41E">
+          <wp:inline distT="0" distB="0" distL="0" distR="0" wp14:anchorId="10E424BD" wp14:editId="1B62326A">
             <wp:extent cx="5580000" cy="2266875"/>
             <wp:effectExtent l="0" t="0" r="0" b="0"/>
             <wp:docPr id="2" name="Picture 2"/>
@@ -4946,9 +4947,8 @@
       <w:pPr>
         <w:pStyle w:val="Heading1"/>
       </w:pPr>
-      <w:bookmarkStart w:id="29" w:name="_Toc242290551"/>
+      <w:bookmarkStart w:id="29" w:name="_Toc242346824"/>
       <w:r>
-        <w:lastRenderedPageBreak/>
         <w:t>12. Impacto y utilización</w:t>
       </w:r>
       <w:bookmarkEnd w:id="29"/>
@@ -4957,7 +4957,7 @@
       <w:pPr>
         <w:pStyle w:val="Heading2"/>
       </w:pPr>
-      <w:bookmarkStart w:id="30" w:name="_Toc242290552"/>
+      <w:bookmarkStart w:id="30" w:name="_Toc242346825"/>
       <w:r>
         <w:t>12.1 Impacto en docencia</w:t>
       </w:r>
@@ -4972,7 +4972,7 @@
       <w:pPr>
         <w:pStyle w:val="Heading2"/>
       </w:pPr>
-      <w:bookmarkStart w:id="31" w:name="_Toc242290553"/>
+      <w:bookmarkStart w:id="31" w:name="_Toc242346826"/>
       <w:r>
         <w:t>12.2 Impacto en investigación</w:t>
       </w:r>
@@ -4987,7 +4987,7 @@
       <w:pPr>
         <w:pStyle w:val="Heading2"/>
       </w:pPr>
-      <w:bookmarkStart w:id="32" w:name="_Toc242290554"/>
+      <w:bookmarkStart w:id="32" w:name="_Toc242346827"/>
       <w:r>
         <w:t>12.3 Impacto en extensión</w:t>
       </w:r>
@@ -5002,7 +5002,7 @@
       <w:pPr>
         <w:pStyle w:val="Heading2"/>
       </w:pPr>
-      <w:bookmarkStart w:id="33" w:name="_Toc242290555"/>
+      <w:bookmarkStart w:id="33" w:name="_Toc242346828"/>
       <w:r>
         <w:t>12.4 Usuarios y utilización</w:t>
       </w:r>
@@ -5017,8 +5017,9 @@
       <w:pPr>
         <w:pStyle w:val="Heading1"/>
       </w:pPr>
-      <w:bookmarkStart w:id="34" w:name="_Toc242290556"/>
+      <w:bookmarkStart w:id="34" w:name="_Toc242346829"/>
       <w:r>
+        <w:lastRenderedPageBreak/>
         <w:t>13. Contribución al estado del arte</w:t>
       </w:r>
       <w:bookmarkEnd w:id="34"/>
@@ -5027,7 +5028,7 @@
       <w:pPr>
         <w:pStyle w:val="Heading2"/>
       </w:pPr>
-      <w:bookmarkStart w:id="35" w:name="_Toc242290557"/>
+      <w:bookmarkStart w:id="35" w:name="_Toc242346830"/>
       <w:r>
         <w:t>13.1 Problema abordado</w:t>
       </w:r>
@@ -5042,7 +5043,7 @@
       <w:pPr>
         <w:pStyle w:val="Heading2"/>
       </w:pPr>
-      <w:bookmarkStart w:id="36" w:name="_Toc242290558"/>
+      <w:bookmarkStart w:id="36" w:name="_Toc242346831"/>
       <w:r>
         <w:t>13.2 Estado del arte</w:t>
       </w:r>
@@ -5056,18 +5057,14 @@
         <w:t xml:space="preserve"> regresión isotónica (Zadrozny y Elkan, 2002), y el error de calibración esperado se usa para medirla (Naeini et al., 2015). La predicción selectiva, que permite abstenerse cuando el riesgo es alto, parte del compromiso entre error y rechazo de Chow (1970) y fue formulada para redes profundas por Geifman y El-Yaniv (2017). Para detectar entradas fuera de distribución se han propuesto la probabilidad máxima del softmax (Hendrycks y Gimpel, 2017), la distancia de Mahalanobis (Lee et al., 2018), la energía (Li</w:t>
       </w:r>
       <w:r>
-        <w:t xml:space="preserve">u et al., 2020) y los vecinos más </w:t>
-      </w:r>
-      <w:r>
-        <w:lastRenderedPageBreak/>
-        <w:t>cercanos (Sun et al., 2022). Larson et al. (2019) publicaron un conjunto de datos de intención con consultas fuera de alcance. Los ensambles proporcionan estimaciones de incertidumbre (Lakshminarayanan et al., 2017). En aprendizaje continuo, el olvido catastrófico (Kirkpatrick et al., 2017) se mitiga con regularización o con memorias de ejemplos y prototipos (Rebuffi et al., 2017).</w:t>
+        <w:t>u et al., 2020) y los vecinos más cercanos (Sun et al., 2022). Larson et al. (2019) publicaron un conjunto de datos de intención con consultas fuera de alcance. Los ensambles proporcionan estimaciones de incertidumbre (Lakshminarayanan et al., 2017). En aprendizaje continuo, el olvido catastrófico (Kirkpatrick et al., 2017) se mitiga con regularización o con memorias de ejemplos y prototipos (Rebuffi et al., 2017).</w:t>
       </w:r>
     </w:p>
     <w:p>
       <w:pPr>
         <w:pStyle w:val="Heading2"/>
       </w:pPr>
-      <w:bookmarkStart w:id="37" w:name="_Toc242290559"/>
+      <w:bookmarkStart w:id="37" w:name="_Toc242346832"/>
       <w:r>
         <w:t>13.3 Limitaciones actuales del estado del arte</w:t>
       </w:r>
@@ -5082,7 +5079,7 @@
       <w:pPr>
         <w:pStyle w:val="Heading2"/>
       </w:pPr>
-      <w:bookmarkStart w:id="38" w:name="_Toc242290560"/>
+      <w:bookmarkStart w:id="38" w:name="_Toc242346833"/>
       <w:r>
         <w:t>13.4 Impacto de VoxControlResearch sobre el estado del arte</w:t>
       </w:r>
@@ -5100,7 +5097,7 @@
       <w:pPr>
         <w:pStyle w:val="Heading1"/>
       </w:pPr>
-      <w:bookmarkStart w:id="39" w:name="_Toc242290561"/>
+      <w:bookmarkStart w:id="39" w:name="_Toc242346834"/>
       <w:r>
         <w:t>14. Aportes del autor</w:t>
       </w:r>
@@ -5116,6 +5113,7 @@
         <w:pStyle w:val="ListBullet"/>
       </w:pPr>
       <w:r>
+        <w:lastRenderedPageBreak/>
         <w:t>Formulación del problema y de la pregunta de investigación.</w:t>
       </w:r>
     </w:p>
@@ -5163,7 +5161,7 @@
       <w:pPr>
         <w:pStyle w:val="Heading1"/>
       </w:pPr>
-      <w:bookmarkStart w:id="40" w:name="_Toc242290562"/>
+      <w:bookmarkStart w:id="40" w:name="_Toc242346835"/>
       <w:r>
         <w:t>Referencias</w:t>
       </w:r>
@@ -5191,7 +5189,6 @@
     </w:p>
     <w:p>
       <w:r>
-        <w:lastRenderedPageBreak/>
         <w:t>Hendrycks, D. y Gimpel, K. (2017). A baseline for detecting misclassified and out-of-distribution examples in neural networks. ICLR.</w:t>
       </w:r>
     </w:p>
@@ -5252,6 +5249,7 @@
     </w:p>
     <w:p>
       <w:r>
+        <w:lastRenderedPageBreak/>
         <w:t>Sun, Y., Ming, Y., Zhu, X. y Li, Y. (2022). Out-of-distribution detection with deep nearest neighbors. ICML.</w:t>
       </w:r>
     </w:p>
@@ -5448,31 +5446,31 @@
       </w:rPr>
     </w:lvl>
   </w:abstractNum>
-  <w:num w:numId="1" w16cid:durableId="1902056357">
+  <w:num w:numId="1" w16cid:durableId="385950886">
     <w:abstractNumId w:val="8"/>
   </w:num>
-  <w:num w:numId="2" w16cid:durableId="1489518908">
+  <w:num w:numId="2" w16cid:durableId="1248803744">
     <w:abstractNumId w:val="6"/>
   </w:num>
-  <w:num w:numId="3" w16cid:durableId="533422604">
+  <w:num w:numId="3" w16cid:durableId="58406845">
     <w:abstractNumId w:val="5"/>
   </w:num>
-  <w:num w:numId="4" w16cid:durableId="1461144360">
+  <w:num w:numId="4" w16cid:durableId="2116901782">
     <w:abstractNumId w:val="4"/>
   </w:num>
-  <w:num w:numId="5" w16cid:durableId="140000052">
+  <w:num w:numId="5" w16cid:durableId="187259723">
     <w:abstractNumId w:val="7"/>
   </w:num>
-  <w:num w:numId="6" w16cid:durableId="1540047486">
+  <w:num w:numId="6" w16cid:durableId="471020827">
     <w:abstractNumId w:val="3"/>
   </w:num>
-  <w:num w:numId="7" w16cid:durableId="253559702">
+  <w:num w:numId="7" w16cid:durableId="1003509585">
     <w:abstractNumId w:val="2"/>
   </w:num>
-  <w:num w:numId="8" w16cid:durableId="1328054162">
+  <w:num w:numId="8" w16cid:durableId="831917480">
     <w:abstractNumId w:val="1"/>
   </w:num>
-  <w:num w:numId="9" w16cid:durableId="1165240406">
+  <w:num w:numId="9" w16cid:durableId="222839119">
     <w:abstractNumId w:val="0"/>
   </w:num>
 </w:numbering>
@@ -16873,7 +16871,7 @@
     <w:autoRedefine/>
     <w:uiPriority w:val="39"/>
     <w:unhideWhenUsed/>
-    <w:rsid w:val="00E929DA"/>
+    <w:rsid w:val="00F700C1"/>
     <w:pPr>
       <w:spacing w:after="100"/>
     </w:pPr>
@@ -16885,7 +16883,7 @@
     <w:autoRedefine/>
     <w:uiPriority w:val="39"/>
     <w:unhideWhenUsed/>
-    <w:rsid w:val="00E929DA"/>
+    <w:rsid w:val="00F700C1"/>
     <w:pPr>
       <w:spacing w:after="100"/>
       <w:ind w:left="220"/>
@@ -16898,7 +16896,7 @@
     <w:autoRedefine/>
     <w:uiPriority w:val="39"/>
     <w:unhideWhenUsed/>
-    <w:rsid w:val="00E929DA"/>
+    <w:rsid w:val="00F700C1"/>
     <w:pPr>
       <w:spacing w:after="100"/>
       <w:ind w:left="440"/>
@@ -16909,7 +16907,7 @@
     <w:basedOn w:val="DefaultParagraphFont"/>
     <w:uiPriority w:val="99"/>
     <w:unhideWhenUsed/>
-    <w:rsid w:val="00E929DA"/>
+    <w:rsid w:val="00F700C1"/>
     <w:rPr>
       <w:color w:val="0000FF" w:themeColor="hyperlink"/>
       <w:u w:val="single"/>

</xml_diff>

<commit_message>
Corrige prueba de contexto, cifra de riesgo alto y mensajes al cambiar de idioma
</commit_message>
<xml_diff>
--- a/manuales/Descripcion_del_Software_VoxControlResearch.docx
+++ b/manuales/Descripcion_del_Software_VoxControlResearch.docx
@@ -216,7 +216,7 @@
       <w:r>
         <w:fldChar w:fldCharType="separate"/>
       </w:r>
-      <w:hyperlink w:anchor="_Toc242346795" w:history="1">
+      <w:hyperlink w:anchor="_Toc242351647" w:history="1">
         <w:r>
           <w:rPr>
             <w:rStyle w:val="Hyperlink"/>
@@ -243,7 +243,7 @@
             <w:noProof/>
             <w:webHidden/>
           </w:rPr>
-          <w:instrText xml:space="preserve"> PAGEREF _Toc242346795 \h </w:instrText>
+          <w:instrText xml:space="preserve"> PAGEREF _Toc242351647 \h </w:instrText>
         </w:r>
         <w:r>
           <w:rPr>
@@ -290,7 +290,7 @@
           <w14:ligatures w14:val="standardContextual"/>
         </w:rPr>
       </w:pPr>
-      <w:hyperlink w:anchor="_Toc242346796" w:history="1">
+      <w:hyperlink w:anchor="_Toc242351648" w:history="1">
         <w:r>
           <w:rPr>
             <w:rStyle w:val="Hyperlink"/>
@@ -317,7 +317,7 @@
             <w:noProof/>
             <w:webHidden/>
           </w:rPr>
-          <w:instrText xml:space="preserve"> PAGEREF _Toc242346796 \h </w:instrText>
+          <w:instrText xml:space="preserve"> PAGEREF _Toc242351648 \h </w:instrText>
         </w:r>
         <w:r>
           <w:rPr>
@@ -364,7 +364,7 @@
           <w14:ligatures w14:val="standardContextual"/>
         </w:rPr>
       </w:pPr>
-      <w:hyperlink w:anchor="_Toc242346797" w:history="1">
+      <w:hyperlink w:anchor="_Toc242351649" w:history="1">
         <w:r>
           <w:rPr>
             <w:rStyle w:val="Hyperlink"/>
@@ -391,7 +391,7 @@
             <w:noProof/>
             <w:webHidden/>
           </w:rPr>
-          <w:instrText xml:space="preserve"> PAGEREF _Toc242346797 \h </w:instrText>
+          <w:instrText xml:space="preserve"> PAGEREF _Toc242351649 \h </w:instrText>
         </w:r>
         <w:r>
           <w:rPr>
@@ -438,7 +438,7 @@
           <w14:ligatures w14:val="standardContextual"/>
         </w:rPr>
       </w:pPr>
-      <w:hyperlink w:anchor="_Toc242346798" w:history="1">
+      <w:hyperlink w:anchor="_Toc242351650" w:history="1">
         <w:r>
           <w:rPr>
             <w:rStyle w:val="Hyperlink"/>
@@ -465,7 +465,7 @@
             <w:noProof/>
             <w:webHidden/>
           </w:rPr>
-          <w:instrText xml:space="preserve"> PAGEREF _Toc242346798 \h </w:instrText>
+          <w:instrText xml:space="preserve"> PAGEREF _Toc242351650 \h </w:instrText>
         </w:r>
         <w:r>
           <w:rPr>
@@ -512,7 +512,7 @@
           <w14:ligatures w14:val="standardContextual"/>
         </w:rPr>
       </w:pPr>
-      <w:hyperlink w:anchor="_Toc242346799" w:history="1">
+      <w:hyperlink w:anchor="_Toc242351651" w:history="1">
         <w:r>
           <w:rPr>
             <w:rStyle w:val="Hyperlink"/>
@@ -539,7 +539,7 @@
             <w:noProof/>
             <w:webHidden/>
           </w:rPr>
-          <w:instrText xml:space="preserve"> PAGEREF _Toc242346799 \h </w:instrText>
+          <w:instrText xml:space="preserve"> PAGEREF _Toc242351651 \h </w:instrText>
         </w:r>
         <w:r>
           <w:rPr>
@@ -586,7 +586,7 @@
           <w14:ligatures w14:val="standardContextual"/>
         </w:rPr>
       </w:pPr>
-      <w:hyperlink w:anchor="_Toc242346800" w:history="1">
+      <w:hyperlink w:anchor="_Toc242351652" w:history="1">
         <w:r>
           <w:rPr>
             <w:rStyle w:val="Hyperlink"/>
@@ -613,7 +613,7 @@
             <w:noProof/>
             <w:webHidden/>
           </w:rPr>
-          <w:instrText xml:space="preserve"> PAGEREF _Toc242346800 \h </w:instrText>
+          <w:instrText xml:space="preserve"> PAGEREF _Toc242351652 \h </w:instrText>
         </w:r>
         <w:r>
           <w:rPr>
@@ -660,7 +660,7 @@
           <w14:ligatures w14:val="standardContextual"/>
         </w:rPr>
       </w:pPr>
-      <w:hyperlink w:anchor="_Toc242346801" w:history="1">
+      <w:hyperlink w:anchor="_Toc242351653" w:history="1">
         <w:r>
           <w:rPr>
             <w:rStyle w:val="Hyperlink"/>
@@ -687,7 +687,7 @@
             <w:noProof/>
             <w:webHidden/>
           </w:rPr>
-          <w:instrText xml:space="preserve"> PAGEREF _Toc242346801 \h </w:instrText>
+          <w:instrText xml:space="preserve"> PAGEREF _Toc242351653 \h </w:instrText>
         </w:r>
         <w:r>
           <w:rPr>
@@ -734,7 +734,7 @@
           <w14:ligatures w14:val="standardContextual"/>
         </w:rPr>
       </w:pPr>
-      <w:hyperlink w:anchor="_Toc242346802" w:history="1">
+      <w:hyperlink w:anchor="_Toc242351654" w:history="1">
         <w:r>
           <w:rPr>
             <w:rStyle w:val="Hyperlink"/>
@@ -761,7 +761,7 @@
             <w:noProof/>
             <w:webHidden/>
           </w:rPr>
-          <w:instrText xml:space="preserve"> PAGEREF _Toc242346802 \h </w:instrText>
+          <w:instrText xml:space="preserve"> PAGEREF _Toc242351654 \h </w:instrText>
         </w:r>
         <w:r>
           <w:rPr>
@@ -808,7 +808,7 @@
           <w14:ligatures w14:val="standardContextual"/>
         </w:rPr>
       </w:pPr>
-      <w:hyperlink w:anchor="_Toc242346803" w:history="1">
+      <w:hyperlink w:anchor="_Toc242351655" w:history="1">
         <w:r>
           <w:rPr>
             <w:rStyle w:val="Hyperlink"/>
@@ -835,7 +835,7 @@
             <w:noProof/>
             <w:webHidden/>
           </w:rPr>
-          <w:instrText xml:space="preserve"> PAGEREF _Toc242346803 \h </w:instrText>
+          <w:instrText xml:space="preserve"> PAGEREF _Toc242351655 \h </w:instrText>
         </w:r>
         <w:r>
           <w:rPr>
@@ -882,7 +882,7 @@
           <w14:ligatures w14:val="standardContextual"/>
         </w:rPr>
       </w:pPr>
-      <w:hyperlink w:anchor="_Toc242346804" w:history="1">
+      <w:hyperlink w:anchor="_Toc242351656" w:history="1">
         <w:r>
           <w:rPr>
             <w:rStyle w:val="Hyperlink"/>
@@ -909,7 +909,7 @@
             <w:noProof/>
             <w:webHidden/>
           </w:rPr>
-          <w:instrText xml:space="preserve"> PAGEREF _Toc242346804 \h </w:instrText>
+          <w:instrText xml:space="preserve"> PAGEREF _Toc242351656 \h </w:instrText>
         </w:r>
         <w:r>
           <w:rPr>
@@ -956,7 +956,7 @@
           <w14:ligatures w14:val="standardContextual"/>
         </w:rPr>
       </w:pPr>
-      <w:hyperlink w:anchor="_Toc242346805" w:history="1">
+      <w:hyperlink w:anchor="_Toc242351657" w:history="1">
         <w:r>
           <w:rPr>
             <w:rStyle w:val="Hyperlink"/>
@@ -983,7 +983,7 @@
             <w:noProof/>
             <w:webHidden/>
           </w:rPr>
-          <w:instrText xml:space="preserve"> PAGEREF _Toc242346805 \h </w:instrText>
+          <w:instrText xml:space="preserve"> PAGEREF _Toc242351657 \h </w:instrText>
         </w:r>
         <w:r>
           <w:rPr>
@@ -1030,7 +1030,7 @@
           <w14:ligatures w14:val="standardContextual"/>
         </w:rPr>
       </w:pPr>
-      <w:hyperlink w:anchor="_Toc242346806" w:history="1">
+      <w:hyperlink w:anchor="_Toc242351658" w:history="1">
         <w:r>
           <w:rPr>
             <w:rStyle w:val="Hyperlink"/>
@@ -1057,7 +1057,7 @@
             <w:noProof/>
             <w:webHidden/>
           </w:rPr>
-          <w:instrText xml:space="preserve"> PAGEREF _Toc242346806 \h </w:instrText>
+          <w:instrText xml:space="preserve"> PAGEREF _Toc242351658 \h </w:instrText>
         </w:r>
         <w:r>
           <w:rPr>
@@ -1104,7 +1104,7 @@
           <w14:ligatures w14:val="standardContextual"/>
         </w:rPr>
       </w:pPr>
-      <w:hyperlink w:anchor="_Toc242346807" w:history="1">
+      <w:hyperlink w:anchor="_Toc242351659" w:history="1">
         <w:r>
           <w:rPr>
             <w:rStyle w:val="Hyperlink"/>
@@ -1131,7 +1131,7 @@
             <w:noProof/>
             <w:webHidden/>
           </w:rPr>
-          <w:instrText xml:space="preserve"> PAGEREF _Toc242346807 \h </w:instrText>
+          <w:instrText xml:space="preserve"> PAGEREF _Toc242351659 \h </w:instrText>
         </w:r>
         <w:r>
           <w:rPr>
@@ -1178,7 +1178,7 @@
           <w14:ligatures w14:val="standardContextual"/>
         </w:rPr>
       </w:pPr>
-      <w:hyperlink w:anchor="_Toc242346808" w:history="1">
+      <w:hyperlink w:anchor="_Toc242351660" w:history="1">
         <w:r>
           <w:rPr>
             <w:rStyle w:val="Hyperlink"/>
@@ -1205,7 +1205,7 @@
             <w:noProof/>
             <w:webHidden/>
           </w:rPr>
-          <w:instrText xml:space="preserve"> PAGEREF _Toc242346808 \h </w:instrText>
+          <w:instrText xml:space="preserve"> PAGEREF _Toc242351660 \h </w:instrText>
         </w:r>
         <w:r>
           <w:rPr>
@@ -1252,7 +1252,7 @@
           <w14:ligatures w14:val="standardContextual"/>
         </w:rPr>
       </w:pPr>
-      <w:hyperlink w:anchor="_Toc242346809" w:history="1">
+      <w:hyperlink w:anchor="_Toc242351661" w:history="1">
         <w:r>
           <w:rPr>
             <w:rStyle w:val="Hyperlink"/>
@@ -1279,7 +1279,7 @@
             <w:noProof/>
             <w:webHidden/>
           </w:rPr>
-          <w:instrText xml:space="preserve"> PAGEREF _Toc242346809 \h </w:instrText>
+          <w:instrText xml:space="preserve"> PAGEREF _Toc242351661 \h </w:instrText>
         </w:r>
         <w:r>
           <w:rPr>
@@ -1326,7 +1326,7 @@
           <w14:ligatures w14:val="standardContextual"/>
         </w:rPr>
       </w:pPr>
-      <w:hyperlink w:anchor="_Toc242346810" w:history="1">
+      <w:hyperlink w:anchor="_Toc242351662" w:history="1">
         <w:r>
           <w:rPr>
             <w:rStyle w:val="Hyperlink"/>
@@ -1353,7 +1353,7 @@
             <w:noProof/>
             <w:webHidden/>
           </w:rPr>
-          <w:instrText xml:space="preserve"> PAGEREF _Toc242346810 \h </w:instrText>
+          <w:instrText xml:space="preserve"> PAGEREF _Toc242351662 \h </w:instrText>
         </w:r>
         <w:r>
           <w:rPr>
@@ -1400,7 +1400,7 @@
           <w14:ligatures w14:val="standardContextual"/>
         </w:rPr>
       </w:pPr>
-      <w:hyperlink w:anchor="_Toc242346811" w:history="1">
+      <w:hyperlink w:anchor="_Toc242351663" w:history="1">
         <w:r>
           <w:rPr>
             <w:rStyle w:val="Hyperlink"/>
@@ -1427,7 +1427,7 @@
             <w:noProof/>
             <w:webHidden/>
           </w:rPr>
-          <w:instrText xml:space="preserve"> PAGEREF _Toc242346811 \h </w:instrText>
+          <w:instrText xml:space="preserve"> PAGEREF _Toc242351663 \h </w:instrText>
         </w:r>
         <w:r>
           <w:rPr>
@@ -1474,7 +1474,7 @@
           <w14:ligatures w14:val="standardContextual"/>
         </w:rPr>
       </w:pPr>
-      <w:hyperlink w:anchor="_Toc242346812" w:history="1">
+      <w:hyperlink w:anchor="_Toc242351664" w:history="1">
         <w:r>
           <w:rPr>
             <w:rStyle w:val="Hyperlink"/>
@@ -1501,7 +1501,7 @@
             <w:noProof/>
             <w:webHidden/>
           </w:rPr>
-          <w:instrText xml:space="preserve"> PAGEREF _Toc242346812 \h </w:instrText>
+          <w:instrText xml:space="preserve"> PAGEREF _Toc242351664 \h </w:instrText>
         </w:r>
         <w:r>
           <w:rPr>
@@ -1548,7 +1548,7 @@
           <w14:ligatures w14:val="standardContextual"/>
         </w:rPr>
       </w:pPr>
-      <w:hyperlink w:anchor="_Toc242346813" w:history="1">
+      <w:hyperlink w:anchor="_Toc242351665" w:history="1">
         <w:r>
           <w:rPr>
             <w:rStyle w:val="Hyperlink"/>
@@ -1575,7 +1575,7 @@
             <w:noProof/>
             <w:webHidden/>
           </w:rPr>
-          <w:instrText xml:space="preserve"> PAGEREF _Toc242346813 \h </w:instrText>
+          <w:instrText xml:space="preserve"> PAGEREF _Toc242351665 \h </w:instrText>
         </w:r>
         <w:r>
           <w:rPr>
@@ -1622,7 +1622,7 @@
           <w14:ligatures w14:val="standardContextual"/>
         </w:rPr>
       </w:pPr>
-      <w:hyperlink w:anchor="_Toc242346814" w:history="1">
+      <w:hyperlink w:anchor="_Toc242351666" w:history="1">
         <w:r>
           <w:rPr>
             <w:rStyle w:val="Hyperlink"/>
@@ -1649,7 +1649,7 @@
             <w:noProof/>
             <w:webHidden/>
           </w:rPr>
-          <w:instrText xml:space="preserve"> PAGEREF _Toc242346814 \h </w:instrText>
+          <w:instrText xml:space="preserve"> PAGEREF _Toc242351666 \h </w:instrText>
         </w:r>
         <w:r>
           <w:rPr>
@@ -1696,7 +1696,7 @@
           <w14:ligatures w14:val="standardContextual"/>
         </w:rPr>
       </w:pPr>
-      <w:hyperlink w:anchor="_Toc242346815" w:history="1">
+      <w:hyperlink w:anchor="_Toc242351667" w:history="1">
         <w:r>
           <w:rPr>
             <w:rStyle w:val="Hyperlink"/>
@@ -1723,7 +1723,7 @@
             <w:noProof/>
             <w:webHidden/>
           </w:rPr>
-          <w:instrText xml:space="preserve"> PAGEREF _Toc242346815 \h </w:instrText>
+          <w:instrText xml:space="preserve"> PAGEREF _Toc242351667 \h </w:instrText>
         </w:r>
         <w:r>
           <w:rPr>
@@ -1770,7 +1770,7 @@
           <w14:ligatures w14:val="standardContextual"/>
         </w:rPr>
       </w:pPr>
-      <w:hyperlink w:anchor="_Toc242346816" w:history="1">
+      <w:hyperlink w:anchor="_Toc242351668" w:history="1">
         <w:r>
           <w:rPr>
             <w:rStyle w:val="Hyperlink"/>
@@ -1797,7 +1797,7 @@
             <w:noProof/>
             <w:webHidden/>
           </w:rPr>
-          <w:instrText xml:space="preserve"> PAGEREF _Toc242346816 \h </w:instrText>
+          <w:instrText xml:space="preserve"> PAGEREF _Toc242351668 \h </w:instrText>
         </w:r>
         <w:r>
           <w:rPr>
@@ -1844,7 +1844,7 @@
           <w14:ligatures w14:val="standardContextual"/>
         </w:rPr>
       </w:pPr>
-      <w:hyperlink w:anchor="_Toc242346817" w:history="1">
+      <w:hyperlink w:anchor="_Toc242351669" w:history="1">
         <w:r>
           <w:rPr>
             <w:rStyle w:val="Hyperlink"/>
@@ -1871,7 +1871,7 @@
             <w:noProof/>
             <w:webHidden/>
           </w:rPr>
-          <w:instrText xml:space="preserve"> PAGEREF _Toc242346817 \h </w:instrText>
+          <w:instrText xml:space="preserve"> PAGEREF _Toc242351669 \h </w:instrText>
         </w:r>
         <w:r>
           <w:rPr>
@@ -1918,7 +1918,7 @@
           <w14:ligatures w14:val="standardContextual"/>
         </w:rPr>
       </w:pPr>
-      <w:hyperlink w:anchor="_Toc242346818" w:history="1">
+      <w:hyperlink w:anchor="_Toc242351670" w:history="1">
         <w:r>
           <w:rPr>
             <w:rStyle w:val="Hyperlink"/>
@@ -1945,7 +1945,7 @@
             <w:noProof/>
             <w:webHidden/>
           </w:rPr>
-          <w:instrText xml:space="preserve"> PAGEREF _Toc242346818 \h </w:instrText>
+          <w:instrText xml:space="preserve"> PAGEREF _Toc242351670 \h </w:instrText>
         </w:r>
         <w:r>
           <w:rPr>
@@ -1992,7 +1992,7 @@
           <w14:ligatures w14:val="standardContextual"/>
         </w:rPr>
       </w:pPr>
-      <w:hyperlink w:anchor="_Toc242346819" w:history="1">
+      <w:hyperlink w:anchor="_Toc242351671" w:history="1">
         <w:r>
           <w:rPr>
             <w:rStyle w:val="Hyperlink"/>
@@ -2019,7 +2019,7 @@
             <w:noProof/>
             <w:webHidden/>
           </w:rPr>
-          <w:instrText xml:space="preserve"> PAGEREF _Toc242346819 \h </w:instrText>
+          <w:instrText xml:space="preserve"> PAGEREF _Toc242351671 \h </w:instrText>
         </w:r>
         <w:r>
           <w:rPr>
@@ -2066,7 +2066,7 @@
           <w14:ligatures w14:val="standardContextual"/>
         </w:rPr>
       </w:pPr>
-      <w:hyperlink w:anchor="_Toc242346820" w:history="1">
+      <w:hyperlink w:anchor="_Toc242351672" w:history="1">
         <w:r>
           <w:rPr>
             <w:rStyle w:val="Hyperlink"/>
@@ -2093,7 +2093,7 @@
             <w:noProof/>
             <w:webHidden/>
           </w:rPr>
-          <w:instrText xml:space="preserve"> PAGEREF _Toc242346820 \h </w:instrText>
+          <w:instrText xml:space="preserve"> PAGEREF _Toc242351672 \h </w:instrText>
         </w:r>
         <w:r>
           <w:rPr>
@@ -2140,7 +2140,7 @@
           <w14:ligatures w14:val="standardContextual"/>
         </w:rPr>
       </w:pPr>
-      <w:hyperlink w:anchor="_Toc242346821" w:history="1">
+      <w:hyperlink w:anchor="_Toc242351673" w:history="1">
         <w:r>
           <w:rPr>
             <w:rStyle w:val="Hyperlink"/>
@@ -2167,7 +2167,7 @@
             <w:noProof/>
             <w:webHidden/>
           </w:rPr>
-          <w:instrText xml:space="preserve"> PAGEREF _Toc242346821 \h </w:instrText>
+          <w:instrText xml:space="preserve"> PAGEREF _Toc242351673 \h </w:instrText>
         </w:r>
         <w:r>
           <w:rPr>
@@ -2214,7 +2214,7 @@
           <w14:ligatures w14:val="standardContextual"/>
         </w:rPr>
       </w:pPr>
-      <w:hyperlink w:anchor="_Toc242346822" w:history="1">
+      <w:hyperlink w:anchor="_Toc242351674" w:history="1">
         <w:r>
           <w:rPr>
             <w:rStyle w:val="Hyperlink"/>
@@ -2241,7 +2241,7 @@
             <w:noProof/>
             <w:webHidden/>
           </w:rPr>
-          <w:instrText xml:space="preserve"> PAGEREF _Toc242346822 \h </w:instrText>
+          <w:instrText xml:space="preserve"> PAGEREF _Toc242351674 \h </w:instrText>
         </w:r>
         <w:r>
           <w:rPr>
@@ -2288,7 +2288,7 @@
           <w14:ligatures w14:val="standardContextual"/>
         </w:rPr>
       </w:pPr>
-      <w:hyperlink w:anchor="_Toc242346823" w:history="1">
+      <w:hyperlink w:anchor="_Toc242351675" w:history="1">
         <w:r>
           <w:rPr>
             <w:rStyle w:val="Hyperlink"/>
@@ -2315,7 +2315,7 @@
             <w:noProof/>
             <w:webHidden/>
           </w:rPr>
-          <w:instrText xml:space="preserve"> PAGEREF _Toc242346823 \h </w:instrText>
+          <w:instrText xml:space="preserve"> PAGEREF _Toc242351675 \h </w:instrText>
         </w:r>
         <w:r>
           <w:rPr>
@@ -2362,7 +2362,7 @@
           <w14:ligatures w14:val="standardContextual"/>
         </w:rPr>
       </w:pPr>
-      <w:hyperlink w:anchor="_Toc242346824" w:history="1">
+      <w:hyperlink w:anchor="_Toc242351676" w:history="1">
         <w:r>
           <w:rPr>
             <w:rStyle w:val="Hyperlink"/>
@@ -2389,7 +2389,7 @@
             <w:noProof/>
             <w:webHidden/>
           </w:rPr>
-          <w:instrText xml:space="preserve"> PAGEREF _Toc242346824 \h </w:instrText>
+          <w:instrText xml:space="preserve"> PAGEREF _Toc242351676 \h </w:instrText>
         </w:r>
         <w:r>
           <w:rPr>
@@ -2436,7 +2436,7 @@
           <w14:ligatures w14:val="standardContextual"/>
         </w:rPr>
       </w:pPr>
-      <w:hyperlink w:anchor="_Toc242346825" w:history="1">
+      <w:hyperlink w:anchor="_Toc242351677" w:history="1">
         <w:r>
           <w:rPr>
             <w:rStyle w:val="Hyperlink"/>
@@ -2463,7 +2463,7 @@
             <w:noProof/>
             <w:webHidden/>
           </w:rPr>
-          <w:instrText xml:space="preserve"> PAGEREF _Toc242346825 \h </w:instrText>
+          <w:instrText xml:space="preserve"> PAGEREF _Toc242351677 \h </w:instrText>
         </w:r>
         <w:r>
           <w:rPr>
@@ -2510,7 +2510,7 @@
           <w14:ligatures w14:val="standardContextual"/>
         </w:rPr>
       </w:pPr>
-      <w:hyperlink w:anchor="_Toc242346826" w:history="1">
+      <w:hyperlink w:anchor="_Toc242351678" w:history="1">
         <w:r>
           <w:rPr>
             <w:rStyle w:val="Hyperlink"/>
@@ -2537,7 +2537,7 @@
             <w:noProof/>
             <w:webHidden/>
           </w:rPr>
-          <w:instrText xml:space="preserve"> PAGEREF _Toc242346826 \h </w:instrText>
+          <w:instrText xml:space="preserve"> PAGEREF _Toc242351678 \h </w:instrText>
         </w:r>
         <w:r>
           <w:rPr>
@@ -2584,7 +2584,7 @@
           <w14:ligatures w14:val="standardContextual"/>
         </w:rPr>
       </w:pPr>
-      <w:hyperlink w:anchor="_Toc242346827" w:history="1">
+      <w:hyperlink w:anchor="_Toc242351679" w:history="1">
         <w:r>
           <w:rPr>
             <w:rStyle w:val="Hyperlink"/>
@@ -2611,7 +2611,7 @@
             <w:noProof/>
             <w:webHidden/>
           </w:rPr>
-          <w:instrText xml:space="preserve"> PAGEREF _Toc242346827 \h </w:instrText>
+          <w:instrText xml:space="preserve"> PAGEREF _Toc242351679 \h </w:instrText>
         </w:r>
         <w:r>
           <w:rPr>
@@ -2658,7 +2658,7 @@
           <w14:ligatures w14:val="standardContextual"/>
         </w:rPr>
       </w:pPr>
-      <w:hyperlink w:anchor="_Toc242346828" w:history="1">
+      <w:hyperlink w:anchor="_Toc242351680" w:history="1">
         <w:r>
           <w:rPr>
             <w:rStyle w:val="Hyperlink"/>
@@ -2685,7 +2685,7 @@
             <w:noProof/>
             <w:webHidden/>
           </w:rPr>
-          <w:instrText xml:space="preserve"> PAGEREF _Toc242346828 \h </w:instrText>
+          <w:instrText xml:space="preserve"> PAGEREF _Toc242351680 \h </w:instrText>
         </w:r>
         <w:r>
           <w:rPr>
@@ -2732,7 +2732,7 @@
           <w14:ligatures w14:val="standardContextual"/>
         </w:rPr>
       </w:pPr>
-      <w:hyperlink w:anchor="_Toc242346829" w:history="1">
+      <w:hyperlink w:anchor="_Toc242351681" w:history="1">
         <w:r>
           <w:rPr>
             <w:rStyle w:val="Hyperlink"/>
@@ -2759,7 +2759,7 @@
             <w:noProof/>
             <w:webHidden/>
           </w:rPr>
-          <w:instrText xml:space="preserve"> PAGEREF _Toc242346829 \h </w:instrText>
+          <w:instrText xml:space="preserve"> PAGEREF _Toc242351681 \h </w:instrText>
         </w:r>
         <w:r>
           <w:rPr>
@@ -2806,7 +2806,7 @@
           <w14:ligatures w14:val="standardContextual"/>
         </w:rPr>
       </w:pPr>
-      <w:hyperlink w:anchor="_Toc242346830" w:history="1">
+      <w:hyperlink w:anchor="_Toc242351682" w:history="1">
         <w:r>
           <w:rPr>
             <w:rStyle w:val="Hyperlink"/>
@@ -2833,7 +2833,7 @@
             <w:noProof/>
             <w:webHidden/>
           </w:rPr>
-          <w:instrText xml:space="preserve"> PAGEREF _Toc242346830 \h </w:instrText>
+          <w:instrText xml:space="preserve"> PAGEREF _Toc242351682 \h </w:instrText>
         </w:r>
         <w:r>
           <w:rPr>
@@ -2880,7 +2880,7 @@
           <w14:ligatures w14:val="standardContextual"/>
         </w:rPr>
       </w:pPr>
-      <w:hyperlink w:anchor="_Toc242346831" w:history="1">
+      <w:hyperlink w:anchor="_Toc242351683" w:history="1">
         <w:r>
           <w:rPr>
             <w:rStyle w:val="Hyperlink"/>
@@ -2907,7 +2907,7 @@
             <w:noProof/>
             <w:webHidden/>
           </w:rPr>
-          <w:instrText xml:space="preserve"> PAGEREF _Toc242346831 \h </w:instrText>
+          <w:instrText xml:space="preserve"> PAGEREF _Toc242351683 \h </w:instrText>
         </w:r>
         <w:r>
           <w:rPr>
@@ -2954,7 +2954,7 @@
           <w14:ligatures w14:val="standardContextual"/>
         </w:rPr>
       </w:pPr>
-      <w:hyperlink w:anchor="_Toc242346832" w:history="1">
+      <w:hyperlink w:anchor="_Toc242351684" w:history="1">
         <w:r>
           <w:rPr>
             <w:rStyle w:val="Hyperlink"/>
@@ -2981,7 +2981,7 @@
             <w:noProof/>
             <w:webHidden/>
           </w:rPr>
-          <w:instrText xml:space="preserve"> PAGEREF _Toc242346832 \h </w:instrText>
+          <w:instrText xml:space="preserve"> PAGEREF _Toc242351684 \h </w:instrText>
         </w:r>
         <w:r>
           <w:rPr>
@@ -3028,7 +3028,7 @@
           <w14:ligatures w14:val="standardContextual"/>
         </w:rPr>
       </w:pPr>
-      <w:hyperlink w:anchor="_Toc242346833" w:history="1">
+      <w:hyperlink w:anchor="_Toc242351685" w:history="1">
         <w:r>
           <w:rPr>
             <w:rStyle w:val="Hyperlink"/>
@@ -3055,7 +3055,7 @@
             <w:noProof/>
             <w:webHidden/>
           </w:rPr>
-          <w:instrText xml:space="preserve"> PAGEREF _Toc242346833 \h </w:instrText>
+          <w:instrText xml:space="preserve"> PAGEREF _Toc242351685 \h </w:instrText>
         </w:r>
         <w:r>
           <w:rPr>
@@ -3102,7 +3102,7 @@
           <w14:ligatures w14:val="standardContextual"/>
         </w:rPr>
       </w:pPr>
-      <w:hyperlink w:anchor="_Toc242346834" w:history="1">
+      <w:hyperlink w:anchor="_Toc242351686" w:history="1">
         <w:r>
           <w:rPr>
             <w:rStyle w:val="Hyperlink"/>
@@ -3129,7 +3129,7 @@
             <w:noProof/>
             <w:webHidden/>
           </w:rPr>
-          <w:instrText xml:space="preserve"> PAGEREF _Toc242346834 \h </w:instrText>
+          <w:instrText xml:space="preserve"> PAGEREF _Toc242351686 \h </w:instrText>
         </w:r>
         <w:r>
           <w:rPr>
@@ -3176,7 +3176,7 @@
           <w14:ligatures w14:val="standardContextual"/>
         </w:rPr>
       </w:pPr>
-      <w:hyperlink w:anchor="_Toc242346835" w:history="1">
+      <w:hyperlink w:anchor="_Toc242351687" w:history="1">
         <w:r>
           <w:rPr>
             <w:rStyle w:val="Hyperlink"/>
@@ -3203,7 +3203,7 @@
             <w:noProof/>
             <w:webHidden/>
           </w:rPr>
-          <w:instrText xml:space="preserve"> PAGEREF _Toc242346835 \h </w:instrText>
+          <w:instrText xml:space="preserve"> PAGEREF _Toc242351687 \h </w:instrText>
         </w:r>
         <w:r>
           <w:rPr>
@@ -3248,7 +3248,7 @@
       <w:pPr>
         <w:pStyle w:val="Heading1"/>
       </w:pPr>
-      <w:bookmarkStart w:id="0" w:name="_Toc242346795"/>
+      <w:bookmarkStart w:id="0" w:name="_Toc242351647"/>
       <w:r>
         <w:lastRenderedPageBreak/>
         <w:t>1. Información general del producto</w:t>
@@ -3624,7 +3624,7 @@
               <w:rPr>
                 <w:sz w:val="19"/>
               </w:rPr>
-              <w:t>Funcional. Validado con 10 semillas en diez experimentos y una ablación, con 51 pruebas automáticas y autoprueba del ejecutable.</w:t>
+              <w:t>Funcional. Validado con 10 semillas en diez experimentos y una ablación, con 52 pruebas automáticas y autoprueba del ejecutable.</w:t>
             </w:r>
           </w:p>
         </w:tc>
@@ -3843,7 +3843,7 @@
       <w:pPr>
         <w:pStyle w:val="Heading1"/>
       </w:pPr>
-      <w:bookmarkStart w:id="1" w:name="_Toc242346796"/>
+      <w:bookmarkStart w:id="1" w:name="_Toc242351648"/>
       <w:r>
         <w:t>2. Descripción general del software</w:t>
       </w:r>
@@ -3861,7 +3861,7 @@
       <w:pPr>
         <w:pStyle w:val="Heading2"/>
       </w:pPr>
-      <w:bookmarkStart w:id="2" w:name="_Toc242346797"/>
+      <w:bookmarkStart w:id="2" w:name="_Toc242351649"/>
       <w:r>
         <w:t>2.1 Especificación de requisitos de hardware y software</w:t>
       </w:r>
@@ -3871,7 +3871,7 @@
       <w:pPr>
         <w:pStyle w:val="Heading3"/>
       </w:pPr>
-      <w:bookmarkStart w:id="3" w:name="_Toc242346798"/>
+      <w:bookmarkStart w:id="3" w:name="_Toc242351650"/>
       <w:r>
         <w:t>Requisitos para el usuario final</w:t>
       </w:r>
@@ -3886,7 +3886,7 @@
       <w:pPr>
         <w:pStyle w:val="Heading3"/>
       </w:pPr>
-      <w:bookmarkStart w:id="4" w:name="_Toc242346799"/>
+      <w:bookmarkStart w:id="4" w:name="_Toc242351651"/>
       <w:r>
         <w:lastRenderedPageBreak/>
         <w:t>Entorno de software en modo desarrollo</w:t>
@@ -3902,7 +3902,7 @@
       <w:pPr>
         <w:pStyle w:val="Heading3"/>
       </w:pPr>
-      <w:bookmarkStart w:id="5" w:name="_Toc242346800"/>
+      <w:bookmarkStart w:id="5" w:name="_Toc242351652"/>
       <w:r>
         <w:t>Requisito de operación sin red</w:t>
       </w:r>
@@ -3917,7 +3917,7 @@
       <w:pPr>
         <w:pStyle w:val="Heading2"/>
       </w:pPr>
-      <w:bookmarkStart w:id="6" w:name="_Toc242346801"/>
+      <w:bookmarkStart w:id="6" w:name="_Toc242351653"/>
       <w:r>
         <w:t>2.2 Justificación de los requisitos</w:t>
       </w:r>
@@ -3932,7 +3932,7 @@
       <w:pPr>
         <w:pStyle w:val="Heading1"/>
       </w:pPr>
-      <w:bookmarkStart w:id="7" w:name="_Toc242346802"/>
+      <w:bookmarkStart w:id="7" w:name="_Toc242351654"/>
       <w:r>
         <w:t>3. Objetivos y área de aplicación</w:t>
       </w:r>
@@ -3942,7 +3942,7 @@
       <w:pPr>
         <w:pStyle w:val="Heading2"/>
       </w:pPr>
-      <w:bookmarkStart w:id="8" w:name="_Toc242346803"/>
+      <w:bookmarkStart w:id="8" w:name="_Toc242351655"/>
       <w:r>
         <w:t>3.1 Objetivo general</w:t>
       </w:r>
@@ -3957,7 +3957,7 @@
       <w:pPr>
         <w:pStyle w:val="Heading2"/>
       </w:pPr>
-      <w:bookmarkStart w:id="9" w:name="_Toc242346804"/>
+      <w:bookmarkStart w:id="9" w:name="_Toc242351656"/>
       <w:r>
         <w:t>3.2 Área de aplicación</w:t>
       </w:r>
@@ -3972,7 +3972,7 @@
       <w:pPr>
         <w:pStyle w:val="Heading1"/>
       </w:pPr>
-      <w:bookmarkStart w:id="10" w:name="_Toc242346805"/>
+      <w:bookmarkStart w:id="10" w:name="_Toc242351657"/>
       <w:r>
         <w:t>4. Funcionalidades principales</w:t>
       </w:r>
@@ -4046,7 +4046,7 @@
       <w:pPr>
         <w:pStyle w:val="Heading1"/>
       </w:pPr>
-      <w:bookmarkStart w:id="11" w:name="_Toc242346806"/>
+      <w:bookmarkStart w:id="11" w:name="_Toc242351658"/>
       <w:r>
         <w:lastRenderedPageBreak/>
         <w:t>5. Adaptabilidad, extensibilidad y mantenibilidad</w:t>
@@ -4057,7 +4057,7 @@
       <w:pPr>
         <w:pStyle w:val="Heading3"/>
       </w:pPr>
-      <w:bookmarkStart w:id="12" w:name="_Toc242346807"/>
+      <w:bookmarkStart w:id="12" w:name="_Toc242351659"/>
       <w:r>
         <w:t>Modularidad</w:t>
       </w:r>
@@ -4072,7 +4072,7 @@
       <w:pPr>
         <w:pStyle w:val="Heading3"/>
       </w:pPr>
-      <w:bookmarkStart w:id="13" w:name="_Toc242346808"/>
+      <w:bookmarkStart w:id="13" w:name="_Toc242351660"/>
       <w:r>
         <w:t>Incorporación de nuevas intenciones y modelos</w:t>
       </w:r>
@@ -4087,7 +4087,7 @@
       <w:pPr>
         <w:pStyle w:val="Heading3"/>
       </w:pPr>
-      <w:bookmarkStart w:id="14" w:name="_Toc242346809"/>
+      <w:bookmarkStart w:id="14" w:name="_Toc242351661"/>
       <w:r>
         <w:t>Configuración y parametrización</w:t>
       </w:r>
@@ -4102,7 +4102,7 @@
       <w:pPr>
         <w:pStyle w:val="Heading3"/>
       </w:pPr>
-      <w:bookmarkStart w:id="15" w:name="_Toc242346810"/>
+      <w:bookmarkStart w:id="15" w:name="_Toc242351662"/>
       <w:r>
         <w:t>Facilidad de mantenimiento</w:t>
       </w:r>
@@ -4110,14 +4110,14 @@
     </w:p>
     <w:p>
       <w:r>
-        <w:t>51 pruebas automáticas, una autoprueba del ejecutable y resultados deterministas facilitan detectar regresiones.</w:t>
+        <w:t>52 pruebas automáticas, una autoprueba del ejecutable y resultados deterministas facilitan detectar regresiones.</w:t>
       </w:r>
     </w:p>
     <w:p>
       <w:pPr>
         <w:pStyle w:val="Heading1"/>
       </w:pPr>
-      <w:bookmarkStart w:id="16" w:name="_Toc242346811"/>
+      <w:bookmarkStart w:id="16" w:name="_Toc242351663"/>
       <w:r>
         <w:t>6. Robustez, desempeño y consistencia</w:t>
       </w:r>
@@ -4127,7 +4127,7 @@
       <w:pPr>
         <w:pStyle w:val="Heading2"/>
       </w:pPr>
-      <w:bookmarkStart w:id="17" w:name="_Toc242346812"/>
+      <w:bookmarkStart w:id="17" w:name="_Toc242351664"/>
       <w:r>
         <w:t>6.1 Robustez</w:t>
       </w:r>
@@ -4142,7 +4142,7 @@
       <w:pPr>
         <w:pStyle w:val="Heading2"/>
       </w:pPr>
-      <w:bookmarkStart w:id="18" w:name="_Toc242346813"/>
+      <w:bookmarkStart w:id="18" w:name="_Toc242351665"/>
       <w:r>
         <w:t>6.2 Desempeño</w:t>
       </w:r>
@@ -4150,14 +4150,14 @@
     </w:p>
     <w:p>
       <w:r>
-        <w:t>Duración medida por semilla: experimento principal 10.3–11.5 s, personalización 49.1–63.6 s, audio 210.1–212.3 s. La autoprueba completa del ejecutable tardó 90 s.</w:t>
+        <w:t>Duración medida por semilla: experimento principal 10.3–11.5 s, personalización 49.1–63.6 s, audio 210.1–212.3 s. La autoprueba completa del ejecutable tardó 104 s.</w:t>
       </w:r>
     </w:p>
     <w:p>
       <w:pPr>
         <w:pStyle w:val="Heading2"/>
       </w:pPr>
-      <w:bookmarkStart w:id="19" w:name="_Toc242346814"/>
+      <w:bookmarkStart w:id="19" w:name="_Toc242351666"/>
       <w:r>
         <w:t>6.3 Consistencia y reproducibilidad</w:t>
       </w:r>
@@ -4172,7 +4172,7 @@
       <w:pPr>
         <w:pStyle w:val="Heading1"/>
       </w:pPr>
-      <w:bookmarkStart w:id="20" w:name="_Toc242346815"/>
+      <w:bookmarkStart w:id="20" w:name="_Toc242351667"/>
       <w:r>
         <w:lastRenderedPageBreak/>
         <w:t>7. Interfaz y usabilidad</w:t>
@@ -4194,7 +4194,7 @@
           <w:noProof/>
         </w:rPr>
         <w:drawing>
-          <wp:inline distT="0" distB="0" distL="0" distR="0" wp14:anchorId="5CFB4737" wp14:editId="2EE7E25F">
+          <wp:inline distT="0" distB="0" distL="0" distR="0" wp14:anchorId="650F0D88" wp14:editId="0D8701A9">
             <wp:extent cx="5580000" cy="3833299"/>
             <wp:effectExtent l="0" t="0" r="0" b="0"/>
             <wp:docPr id="1" name="Picture 1"/>
@@ -4250,7 +4250,7 @@
       <w:pPr>
         <w:pStyle w:val="Heading1"/>
       </w:pPr>
-      <w:bookmarkStart w:id="21" w:name="_Toc242346816"/>
+      <w:bookmarkStart w:id="21" w:name="_Toc242351668"/>
       <w:r>
         <w:t>8. Integridad y seguridad de la información</w:t>
       </w:r>
@@ -4265,7 +4265,7 @@
       <w:pPr>
         <w:pStyle w:val="Heading1"/>
       </w:pPr>
-      <w:bookmarkStart w:id="22" w:name="_Toc242346817"/>
+      <w:bookmarkStart w:id="22" w:name="_Toc242351669"/>
       <w:r>
         <w:t>9. Portabilidad y compatibilidad</w:t>
       </w:r>
@@ -4275,7 +4275,7 @@
       <w:pPr>
         <w:pStyle w:val="Heading2"/>
       </w:pPr>
-      <w:bookmarkStart w:id="23" w:name="_Toc242346818"/>
+      <w:bookmarkStart w:id="23" w:name="_Toc242351670"/>
       <w:r>
         <w:t>9.1 Plataformas compatibles</w:t>
       </w:r>
@@ -4290,7 +4290,7 @@
       <w:pPr>
         <w:pStyle w:val="Heading2"/>
       </w:pPr>
-      <w:bookmarkStart w:id="24" w:name="_Toc242346819"/>
+      <w:bookmarkStart w:id="24" w:name="_Toc242351671"/>
       <w:r>
         <w:t>9.2 Dependencias relevantes</w:t>
       </w:r>
@@ -4305,7 +4305,7 @@
       <w:pPr>
         <w:pStyle w:val="Heading2"/>
       </w:pPr>
-      <w:bookmarkStart w:id="25" w:name="_Toc242346820"/>
+      <w:bookmarkStart w:id="25" w:name="_Toc242351672"/>
       <w:r>
         <w:lastRenderedPageBreak/>
         <w:t>9.3 Portabilidad</w:t>
@@ -4321,7 +4321,7 @@
       <w:pPr>
         <w:pStyle w:val="Heading1"/>
       </w:pPr>
-      <w:bookmarkStart w:id="26" w:name="_Toc242346821"/>
+      <w:bookmarkStart w:id="26" w:name="_Toc242351673"/>
       <w:r>
         <w:t>10. Documentación y soporte técnico</w:t>
       </w:r>
@@ -4336,7 +4336,7 @@
       <w:pPr>
         <w:pStyle w:val="Heading3"/>
       </w:pPr>
-      <w:bookmarkStart w:id="27" w:name="_Toc242346822"/>
+      <w:bookmarkStart w:id="27" w:name="_Toc242351674"/>
       <w:r>
         <w:t>Soporte técnico</w:t>
       </w:r>
@@ -4351,7 +4351,7 @@
       <w:pPr>
         <w:pStyle w:val="Heading1"/>
       </w:pPr>
-      <w:bookmarkStart w:id="28" w:name="_Toc242346823"/>
+      <w:bookmarkStart w:id="28" w:name="_Toc242351675"/>
       <w:r>
         <w:t>11. Pruebas, validación y desempeño</w:t>
       </w:r>
@@ -4359,7 +4359,7 @@
     </w:p>
     <w:p>
       <w:r>
-        <w:t>Pruebas automáticas: 51. Validación experimental con semillas 100–109 (10 semillas):</w:t>
+        <w:t>Pruebas automáticas: 52. Validación experimental con semillas 100–109 (10 semillas):</w:t>
       </w:r>
     </w:p>
     <w:p>
@@ -4374,7 +4374,7 @@
         <w:t xml:space="preserve">Tabla 2. </w:t>
       </w:r>
       <w:r>
-        <w:t>Resultado principal (experimento 1).</w:t>
+        <w:t>Resultado principal (experimento 1). Riesgo alto: tasa con cuatro decimales y, entre paréntesis, número de ejecuciones erróneas en 8673 órdenes.</w:t>
       </w:r>
     </w:p>
     <w:tbl>
@@ -4557,7 +4557,7 @@
               <w:rPr>
                 <w:sz w:val="19"/>
               </w:rPr>
-              <w:t>0.007</w:t>
+              <w:t>0.0073 (63)</w:t>
             </w:r>
           </w:p>
         </w:tc>
@@ -4635,7 +4635,7 @@
               <w:rPr>
                 <w:sz w:val="19"/>
               </w:rPr>
-              <w:t>0.089</w:t>
+              <w:t>0.0891 (773)</w:t>
             </w:r>
           </w:p>
         </w:tc>
@@ -4713,7 +4713,7 @@
               <w:rPr>
                 <w:sz w:val="19"/>
               </w:rPr>
-              <w:t>0.002</w:t>
+              <w:t>0.0020 (17)</w:t>
             </w:r>
           </w:p>
         </w:tc>
@@ -4791,7 +4791,7 @@
               <w:rPr>
                 <w:sz w:val="19"/>
               </w:rPr>
-              <w:t>0.004</w:t>
+              <w:t>0.0036 (31)</w:t>
             </w:r>
           </w:p>
         </w:tc>
@@ -4865,7 +4865,7 @@
               <w:rPr>
                 <w:sz w:val="19"/>
               </w:rPr>
-              <w:t>0.000</w:t>
+              <w:t>0.0003 (3)</w:t>
             </w:r>
           </w:p>
         </w:tc>
@@ -4874,10 +4874,10 @@
     <w:p/>
     <w:p>
       <w:r>
-        <w:t>Frente a B3, UCIL redujo el costo medio en todas las semillas (-0.039 [-0.070, -0.007], d_z = -0.87, 10/10 semillas a favor de UCIL). Frente a B4 la diferencia en datos limpios no fue concluyente (-0.046 [-0.121, 0.029], d_z = -0.44, 4/10 semillas a favor de UCIL) y bajo cambio combinado fue -0.063 [-0.084, -0.043], d_z = -2.22, 10/10 semillas a favor de UCIL. UCIL ejecutó más órdenes de bajo riesgo erróneas que B3 y B4 y ninguna de riesgo alto. La capa de calibración y el enrutamiento por riesgo no redujer</w:t>
+        <w:t>Frente a B3, UCIL redujo el costo medio en todas las semillas (-0.039 [-0.070, -0.007], d_z = -0.87, 10/10 semillas a favor de UCIL). Frente a B4 la diferencia en datos limpios no fue concluyente (-0.046 [-0.121, 0.029], d_z = -0.44, 4/10 semillas a favor de UCIL) y bajo cambio combinado fue -0.063 [-0.084, -0.043], d_z = -2.22, 10/10 semillas a favor de UCIL. UCIL ejecutó más órdenes de bajo riesgo erróneas que B3 y B4, y menos de riesgo alto (3 frente a 17 y 31 en 8673 órdenes). La capa de calibración y e</w:t>
       </w:r>
       <w:r>
-        <w:t>on el costo medio en la ablación. La detección OOD y la adaptación sí aportaron.</w:t>
+        <w:t>l enrutamiento por riesgo no redujeron el costo medio en la ablación. La detección OOD y la adaptación sí aportaron.</w:t>
       </w:r>
     </w:p>
     <w:p>
@@ -4891,7 +4891,7 @@
         </w:rPr>
         <w:lastRenderedPageBreak/>
         <w:drawing>
-          <wp:inline distT="0" distB="0" distL="0" distR="0" wp14:anchorId="10E424BD" wp14:editId="1B62326A">
+          <wp:inline distT="0" distB="0" distL="0" distR="0" wp14:anchorId="0F576F6A" wp14:editId="2859DFC5">
             <wp:extent cx="5580000" cy="2266875"/>
             <wp:effectExtent l="0" t="0" r="0" b="0"/>
             <wp:docPr id="2" name="Picture 2"/>
@@ -4947,7 +4947,7 @@
       <w:pPr>
         <w:pStyle w:val="Heading1"/>
       </w:pPr>
-      <w:bookmarkStart w:id="29" w:name="_Toc242346824"/>
+      <w:bookmarkStart w:id="29" w:name="_Toc242351676"/>
       <w:r>
         <w:t>12. Impacto y utilización</w:t>
       </w:r>
@@ -4957,7 +4957,7 @@
       <w:pPr>
         <w:pStyle w:val="Heading2"/>
       </w:pPr>
-      <w:bookmarkStart w:id="30" w:name="_Toc242346825"/>
+      <w:bookmarkStart w:id="30" w:name="_Toc242351677"/>
       <w:r>
         <w:t>12.1 Impacto en docencia</w:t>
       </w:r>
@@ -4972,7 +4972,7 @@
       <w:pPr>
         <w:pStyle w:val="Heading2"/>
       </w:pPr>
-      <w:bookmarkStart w:id="31" w:name="_Toc242346826"/>
+      <w:bookmarkStart w:id="31" w:name="_Toc242351678"/>
       <w:r>
         <w:t>12.2 Impacto en investigación</w:t>
       </w:r>
@@ -4987,7 +4987,7 @@
       <w:pPr>
         <w:pStyle w:val="Heading2"/>
       </w:pPr>
-      <w:bookmarkStart w:id="32" w:name="_Toc242346827"/>
+      <w:bookmarkStart w:id="32" w:name="_Toc242351679"/>
       <w:r>
         <w:t>12.3 Impacto en extensión</w:t>
       </w:r>
@@ -5002,7 +5002,7 @@
       <w:pPr>
         <w:pStyle w:val="Heading2"/>
       </w:pPr>
-      <w:bookmarkStart w:id="33" w:name="_Toc242346828"/>
+      <w:bookmarkStart w:id="33" w:name="_Toc242351680"/>
       <w:r>
         <w:t>12.4 Usuarios y utilización</w:t>
       </w:r>
@@ -5017,7 +5017,7 @@
       <w:pPr>
         <w:pStyle w:val="Heading1"/>
       </w:pPr>
-      <w:bookmarkStart w:id="34" w:name="_Toc242346829"/>
+      <w:bookmarkStart w:id="34" w:name="_Toc242351681"/>
       <w:r>
         <w:lastRenderedPageBreak/>
         <w:t>13. Contribución al estado del arte</w:t>
@@ -5028,7 +5028,7 @@
       <w:pPr>
         <w:pStyle w:val="Heading2"/>
       </w:pPr>
-      <w:bookmarkStart w:id="35" w:name="_Toc242346830"/>
+      <w:bookmarkStart w:id="35" w:name="_Toc242351682"/>
       <w:r>
         <w:t>13.1 Problema abordado</w:t>
       </w:r>
@@ -5043,7 +5043,7 @@
       <w:pPr>
         <w:pStyle w:val="Heading2"/>
       </w:pPr>
-      <w:bookmarkStart w:id="36" w:name="_Toc242346831"/>
+      <w:bookmarkStart w:id="36" w:name="_Toc242351683"/>
       <w:r>
         <w:t>13.2 Estado del arte</w:t>
       </w:r>
@@ -5064,7 +5064,7 @@
       <w:pPr>
         <w:pStyle w:val="Heading2"/>
       </w:pPr>
-      <w:bookmarkStart w:id="37" w:name="_Toc242346832"/>
+      <w:bookmarkStart w:id="37" w:name="_Toc242351684"/>
       <w:r>
         <w:t>13.3 Limitaciones actuales del estado del arte</w:t>
       </w:r>
@@ -5079,7 +5079,7 @@
       <w:pPr>
         <w:pStyle w:val="Heading2"/>
       </w:pPr>
-      <w:bookmarkStart w:id="38" w:name="_Toc242346833"/>
+      <w:bookmarkStart w:id="38" w:name="_Toc242351685"/>
       <w:r>
         <w:t>13.4 Impacto de VoxControlResearch sobre el estado del arte</w:t>
       </w:r>
@@ -5097,7 +5097,7 @@
       <w:pPr>
         <w:pStyle w:val="Heading1"/>
       </w:pPr>
-      <w:bookmarkStart w:id="39" w:name="_Toc242346834"/>
+      <w:bookmarkStart w:id="39" w:name="_Toc242351686"/>
       <w:r>
         <w:t>14. Aportes del autor</w:t>
       </w:r>
@@ -5161,7 +5161,7 @@
       <w:pPr>
         <w:pStyle w:val="Heading1"/>
       </w:pPr>
-      <w:bookmarkStart w:id="40" w:name="_Toc242346835"/>
+      <w:bookmarkStart w:id="40" w:name="_Toc242351687"/>
       <w:r>
         <w:t>Referencias</w:t>
       </w:r>
@@ -5446,31 +5446,31 @@
       </w:rPr>
     </w:lvl>
   </w:abstractNum>
-  <w:num w:numId="1" w16cid:durableId="385950886">
+  <w:num w:numId="1" w16cid:durableId="1551108833">
     <w:abstractNumId w:val="8"/>
   </w:num>
-  <w:num w:numId="2" w16cid:durableId="1248803744">
+  <w:num w:numId="2" w16cid:durableId="1034619981">
     <w:abstractNumId w:val="6"/>
   </w:num>
-  <w:num w:numId="3" w16cid:durableId="58406845">
+  <w:num w:numId="3" w16cid:durableId="1287735348">
     <w:abstractNumId w:val="5"/>
   </w:num>
-  <w:num w:numId="4" w16cid:durableId="2116901782">
+  <w:num w:numId="4" w16cid:durableId="1138298623">
     <w:abstractNumId w:val="4"/>
   </w:num>
-  <w:num w:numId="5" w16cid:durableId="187259723">
+  <w:num w:numId="5" w16cid:durableId="2057701605">
     <w:abstractNumId w:val="7"/>
   </w:num>
-  <w:num w:numId="6" w16cid:durableId="471020827">
+  <w:num w:numId="6" w16cid:durableId="663893012">
     <w:abstractNumId w:val="3"/>
   </w:num>
-  <w:num w:numId="7" w16cid:durableId="1003509585">
+  <w:num w:numId="7" w16cid:durableId="608044540">
     <w:abstractNumId w:val="2"/>
   </w:num>
-  <w:num w:numId="8" w16cid:durableId="831917480">
+  <w:num w:numId="8" w16cid:durableId="225066074">
     <w:abstractNumId w:val="1"/>
   </w:num>
-  <w:num w:numId="9" w16cid:durableId="222839119">
+  <w:num w:numId="9" w16cid:durableId="1706131033">
     <w:abstractNumId w:val="0"/>
   </w:num>
 </w:numbering>
@@ -16871,7 +16871,7 @@
     <w:autoRedefine/>
     <w:uiPriority w:val="39"/>
     <w:unhideWhenUsed/>
-    <w:rsid w:val="00F700C1"/>
+    <w:rsid w:val="00554D8D"/>
     <w:pPr>
       <w:spacing w:after="100"/>
     </w:pPr>
@@ -16883,7 +16883,7 @@
     <w:autoRedefine/>
     <w:uiPriority w:val="39"/>
     <w:unhideWhenUsed/>
-    <w:rsid w:val="00F700C1"/>
+    <w:rsid w:val="00554D8D"/>
     <w:pPr>
       <w:spacing w:after="100"/>
       <w:ind w:left="220"/>
@@ -16896,7 +16896,7 @@
     <w:autoRedefine/>
     <w:uiPriority w:val="39"/>
     <w:unhideWhenUsed/>
-    <w:rsid w:val="00F700C1"/>
+    <w:rsid w:val="00554D8D"/>
     <w:pPr>
       <w:spacing w:after="100"/>
       <w:ind w:left="440"/>
@@ -16907,7 +16907,7 @@
     <w:basedOn w:val="DefaultParagraphFont"/>
     <w:uiPriority w:val="99"/>
     <w:unhideWhenUsed/>
-    <w:rsid w:val="00F700C1"/>
+    <w:rsid w:val="00554D8D"/>
     <w:rPr>
       <w:color w:val="0000FF" w:themeColor="hyperlink"/>
       <w:u w:val="single"/>

</xml_diff>